<commit_message>
更新 Framework PPT 和讲稿
</commit_message>
<xml_diff>
--- a/汇报/总体Framework7_22_详细讲稿.docx
+++ b/汇报/总体Framework7_22_详细讲稿.docx
@@ -7798,6 +7798,2700 @@
           <w:sz w:val="21"/>
         </w:rPr>
         <w:t>汇报时始终围绕三个问题展开即可：现有SHARP已经解决了什么；课题目标还缺少什么；新Framework准备怎样以可验证、可压缩、可移动端渲染的3DGS补上这些缺口。</w:t>
+      </w:r>
+    </w:p>
+    <w:p>
+      <w:r>
+        <w:br w:type="page"/>
+      </w:r>
+    </w:p>
+    <w:p>
+      <w:pPr>
+        <w:spacing w:before="200" w:after="100"/>
+      </w:pPr>
+      <w:r>
+        <w:rPr>
+          <w:rFonts w:ascii="Microsoft YaHei" w:hAnsi="Microsoft YaHei" w:eastAsia="Microsoft YaHei"/>
+          <w:b/>
+          <w:sz w:val="32"/>
+        </w:rPr>
+        <w:t>21. 损失函数附录：每项损失的含义与计算方法</w:t>
+      </w:r>
+    </w:p>
+    <w:p>
+      <w:pPr>
+        <w:spacing w:after="80"/>
+      </w:pPr>
+      <w:r>
+        <w:rPr>
+          <w:rFonts w:ascii="Microsoft YaHei" w:hAnsi="Microsoft YaHei" w:eastAsia="Microsoft YaHei"/>
+          <w:b w:val="0"/>
+          <w:sz w:val="21"/>
+        </w:rPr>
+        <w:t>本章汇总Framework中可能使用的损失。需要先强调：这些损失不会在第一天全部同时启用。不同训练阶段只打开与当前模块有关的损失，最后联合微调时再组合；带“可选”的正则只有在对应问题出现时才加入。</w:t>
+      </w:r>
+    </w:p>
+    <w:tbl>
+      <w:tblPr>
+        <w:tblStyle w:val="TableGrid"/>
+        <w:tblW w:type="auto" w:w="0"/>
+        <w:tblLook w:firstColumn="1" w:firstRow="1" w:lastColumn="0" w:lastRow="0" w:noHBand="0" w:noVBand="1" w:val="04A0"/>
+      </w:tblPr>
+      <w:tblGrid>
+        <w:gridCol w:w="3324"/>
+        <w:gridCol w:w="3324"/>
+        <w:gridCol w:w="3324"/>
+      </w:tblGrid>
+      <w:tr>
+        <w:tc>
+          <w:tcPr>
+            <w:tcW w:type="dxa" w:w="3324"/>
+            <w:vAlign w:val="center"/>
+            <w:shd w:fill="D9EAF7"/>
+          </w:tcPr>
+          <w:p>
+            <w:pPr>
+              <w:jc w:val="left"/>
+            </w:pPr>
+            <w:r/>
+            <w:r>
+              <w:rPr>
+                <w:rFonts w:ascii="Microsoft YaHei" w:hAnsi="Microsoft YaHei" w:eastAsia="Microsoft YaHei"/>
+                <w:b/>
+                <w:sz w:val="19"/>
+              </w:rPr>
+              <w:t>损失组</w:t>
+            </w:r>
+          </w:p>
+        </w:tc>
+        <w:tc>
+          <w:tcPr>
+            <w:tcW w:type="dxa" w:w="3324"/>
+            <w:vAlign w:val="center"/>
+            <w:shd w:fill="D9EAF7"/>
+          </w:tcPr>
+          <w:p>
+            <w:pPr>
+              <w:jc w:val="left"/>
+            </w:pPr>
+            <w:r/>
+            <w:r>
+              <w:rPr>
+                <w:rFonts w:ascii="Microsoft YaHei" w:hAnsi="Microsoft YaHei" w:eastAsia="Microsoft YaHei"/>
+                <w:b/>
+                <w:sz w:val="19"/>
+              </w:rPr>
+              <w:t>主要组成</w:t>
+            </w:r>
+          </w:p>
+        </w:tc>
+        <w:tc>
+          <w:tcPr>
+            <w:tcW w:type="dxa" w:w="3324"/>
+            <w:vAlign w:val="center"/>
+            <w:shd w:fill="D9EAF7"/>
+          </w:tcPr>
+          <w:p>
+            <w:pPr>
+              <w:jc w:val="left"/>
+            </w:pPr>
+            <w:r/>
+            <w:r>
+              <w:rPr>
+                <w:rFonts w:ascii="Microsoft YaHei" w:hAnsi="Microsoft YaHei" w:eastAsia="Microsoft YaHei"/>
+                <w:b/>
+                <w:sz w:val="19"/>
+              </w:rPr>
+              <w:t>解决的问题</w:t>
+            </w:r>
+          </w:p>
+        </w:tc>
+      </w:tr>
+      <w:tr>
+        <w:tc>
+          <w:tcPr>
+            <w:tcW w:type="dxa" w:w="3324"/>
+            <w:vAlign w:val="center"/>
+          </w:tcPr>
+          <w:p>
+            <w:pPr>
+              <w:jc w:val="left"/>
+            </w:pPr>
+            <w:r/>
+            <w:r>
+              <w:rPr>
+                <w:rFonts w:ascii="Microsoft YaHei" w:hAnsi="Microsoft YaHei" w:eastAsia="Microsoft YaHei"/>
+                <w:b w:val="0"/>
+                <w:sz w:val="18"/>
+              </w:rPr>
+              <w:t>场景感知</w:t>
+            </w:r>
+          </w:p>
+        </w:tc>
+        <w:tc>
+          <w:tcPr>
+            <w:tcW w:type="dxa" w:w="3324"/>
+            <w:vAlign w:val="center"/>
+          </w:tcPr>
+          <w:p>
+            <w:pPr>
+              <w:jc w:val="left"/>
+            </w:pPr>
+            <w:r/>
+            <w:r>
+              <w:rPr>
+                <w:rFonts w:ascii="Microsoft YaHei" w:hAnsi="Microsoft YaHei" w:eastAsia="Microsoft YaHei"/>
+                <w:b w:val="0"/>
+                <w:sz w:val="18"/>
+              </w:rPr>
+              <w:t>Depth、Edge、Alpha、Thin、Material、Confidence</w:t>
+            </w:r>
+          </w:p>
+        </w:tc>
+        <w:tc>
+          <w:tcPr>
+            <w:tcW w:type="dxa" w:w="3324"/>
+            <w:vAlign w:val="center"/>
+          </w:tcPr>
+          <w:p>
+            <w:pPr>
+              <w:jc w:val="left"/>
+            </w:pPr>
+            <w:r/>
+            <w:r>
+              <w:rPr>
+                <w:rFonts w:ascii="Microsoft YaHei" w:hAnsi="Microsoft YaHei" w:eastAsia="Microsoft YaHei"/>
+                <w:b w:val="0"/>
+                <w:sz w:val="18"/>
+              </w:rPr>
+              <w:t>教各任务Head输出正确的辅助信息</w:t>
+            </w:r>
+          </w:p>
+        </w:tc>
+      </w:tr>
+      <w:tr>
+        <w:tc>
+          <w:tcPr>
+            <w:tcW w:type="dxa" w:w="3324"/>
+            <w:vAlign w:val="center"/>
+          </w:tcPr>
+          <w:p>
+            <w:pPr>
+              <w:jc w:val="left"/>
+            </w:pPr>
+            <w:r/>
+            <w:r>
+              <w:rPr>
+                <w:rFonts w:ascii="Microsoft YaHei" w:hAnsi="Microsoft YaHei" w:eastAsia="Microsoft YaHei"/>
+                <w:b w:val="0"/>
+                <w:sz w:val="18"/>
+              </w:rPr>
+              <w:t>渲染质量</w:t>
+            </w:r>
+          </w:p>
+        </w:tc>
+        <w:tc>
+          <w:tcPr>
+            <w:tcW w:type="dxa" w:w="3324"/>
+            <w:vAlign w:val="center"/>
+          </w:tcPr>
+          <w:p>
+            <w:pPr>
+              <w:jc w:val="left"/>
+            </w:pPr>
+            <w:r/>
+            <w:r>
+              <w:rPr>
+                <w:rFonts w:ascii="Microsoft YaHei" w:hAnsi="Microsoft YaHei" w:eastAsia="Microsoft YaHei"/>
+                <w:b w:val="0"/>
+                <w:sz w:val="18"/>
+              </w:rPr>
+              <w:t>RGB、DISTS、LPIPS、Depth、Alpha</w:t>
+            </w:r>
+          </w:p>
+        </w:tc>
+        <w:tc>
+          <w:tcPr>
+            <w:tcW w:type="dxa" w:w="3324"/>
+            <w:vAlign w:val="center"/>
+          </w:tcPr>
+          <w:p>
+            <w:pPr>
+              <w:jc w:val="left"/>
+            </w:pPr>
+            <w:r/>
+            <w:r>
+              <w:rPr>
+                <w:rFonts w:ascii="Microsoft YaHei" w:hAnsi="Microsoft YaHei" w:eastAsia="Microsoft YaHei"/>
+                <w:b w:val="0"/>
+                <w:sz w:val="18"/>
+              </w:rPr>
+              <w:t>保证统一高斯在目标视角看起来正确</w:t>
+            </w:r>
+          </w:p>
+        </w:tc>
+      </w:tr>
+      <w:tr>
+        <w:tc>
+          <w:tcPr>
+            <w:tcW w:type="dxa" w:w="3324"/>
+            <w:vAlign w:val="center"/>
+          </w:tcPr>
+          <w:p>
+            <w:pPr>
+              <w:jc w:val="left"/>
+            </w:pPr>
+            <w:r/>
+            <w:r>
+              <w:rPr>
+                <w:rFonts w:ascii="Microsoft YaHei" w:hAnsi="Microsoft YaHei" w:eastAsia="Microsoft YaHei"/>
+                <w:b w:val="0"/>
+                <w:sz w:val="18"/>
+              </w:rPr>
+              <w:t>显露补全</w:t>
+            </w:r>
+          </w:p>
+        </w:tc>
+        <w:tc>
+          <w:tcPr>
+            <w:tcW w:type="dxa" w:w="3324"/>
+            <w:vAlign w:val="center"/>
+          </w:tcPr>
+          <w:p>
+            <w:pPr>
+              <w:jc w:val="left"/>
+            </w:pPr>
+            <w:r/>
+            <w:r>
+              <w:rPr>
+                <w:rFonts w:ascii="Microsoft YaHei" w:hAnsi="Microsoft YaHei" w:eastAsia="Microsoft YaHei"/>
+                <w:b w:val="0"/>
+                <w:sz w:val="18"/>
+              </w:rPr>
+              <w:t>Edge Completion、RGB-D-Alpha、重投影</w:t>
+            </w:r>
+          </w:p>
+        </w:tc>
+        <w:tc>
+          <w:tcPr>
+            <w:tcW w:type="dxa" w:w="3324"/>
+            <w:vAlign w:val="center"/>
+          </w:tcPr>
+          <w:p>
+            <w:pPr>
+              <w:jc w:val="left"/>
+            </w:pPr>
+            <w:r/>
+            <w:r>
+              <w:rPr>
+                <w:rFonts w:ascii="Microsoft YaHei" w:hAnsi="Microsoft YaHei" w:eastAsia="Microsoft YaHei"/>
+                <w:b w:val="0"/>
+                <w:sz w:val="18"/>
+              </w:rPr>
+              <w:t>保证补充内容结构、位置和外观一致</w:t>
+            </w:r>
+          </w:p>
+        </w:tc>
+      </w:tr>
+      <w:tr>
+        <w:tc>
+          <w:tcPr>
+            <w:tcW w:type="dxa" w:w="3324"/>
+            <w:vAlign w:val="center"/>
+          </w:tcPr>
+          <w:p>
+            <w:pPr>
+              <w:jc w:val="left"/>
+            </w:pPr>
+            <w:r/>
+            <w:r>
+              <w:rPr>
+                <w:rFonts w:ascii="Microsoft YaHei" w:hAnsi="Microsoft YaHei" w:eastAsia="Microsoft YaHei"/>
+                <w:b w:val="0"/>
+                <w:sz w:val="18"/>
+              </w:rPr>
+              <w:t>跨视角锚点</w:t>
+            </w:r>
+          </w:p>
+        </w:tc>
+        <w:tc>
+          <w:tcPr>
+            <w:tcW w:type="dxa" w:w="3324"/>
+            <w:vAlign w:val="center"/>
+          </w:tcPr>
+          <w:p>
+            <w:pPr>
+              <w:jc w:val="left"/>
+            </w:pPr>
+            <w:r/>
+            <w:r>
+              <w:rPr>
+                <w:rFonts w:ascii="Microsoft YaHei" w:hAnsi="Microsoft YaHei" w:eastAsia="Microsoft YaHei"/>
+                <w:b w:val="0"/>
+                <w:sz w:val="18"/>
+              </w:rPr>
+              <w:t>左右端点与中间视角一致性</w:t>
+            </w:r>
+          </w:p>
+        </w:tc>
+        <w:tc>
+          <w:tcPr>
+            <w:tcW w:type="dxa" w:w="3324"/>
+            <w:vAlign w:val="center"/>
+          </w:tcPr>
+          <w:p>
+            <w:pPr>
+              <w:jc w:val="left"/>
+            </w:pPr>
+            <w:r/>
+            <w:r>
+              <w:rPr>
+                <w:rFonts w:ascii="Microsoft YaHei" w:hAnsi="Microsoft YaHei" w:eastAsia="Microsoft YaHei"/>
+                <w:b w:val="0"/>
+                <w:sz w:val="18"/>
+              </w:rPr>
+              <w:t>防止补充高斯只在单个视角正确</w:t>
+            </w:r>
+          </w:p>
+        </w:tc>
+      </w:tr>
+      <w:tr>
+        <w:tc>
+          <w:tcPr>
+            <w:tcW w:type="dxa" w:w="3324"/>
+            <w:vAlign w:val="center"/>
+          </w:tcPr>
+          <w:p>
+            <w:pPr>
+              <w:jc w:val="left"/>
+            </w:pPr>
+            <w:r/>
+            <w:r>
+              <w:rPr>
+                <w:rFonts w:ascii="Microsoft YaHei" w:hAnsi="Microsoft YaHei" w:eastAsia="Microsoft YaHei"/>
+                <w:b w:val="0"/>
+                <w:sz w:val="18"/>
+              </w:rPr>
+              <w:t>高斯增减</w:t>
+            </w:r>
+          </w:p>
+        </w:tc>
+        <w:tc>
+          <w:tcPr>
+            <w:tcW w:type="dxa" w:w="3324"/>
+            <w:vAlign w:val="center"/>
+          </w:tcPr>
+          <w:p>
+            <w:pPr>
+              <w:jc w:val="left"/>
+            </w:pPr>
+            <w:r/>
+            <w:r>
+              <w:rPr>
+                <w:rFonts w:ascii="Microsoft YaHei" w:hAnsi="Microsoft YaHei" w:eastAsia="Microsoft YaHei"/>
+                <w:b w:val="0"/>
+                <w:sz w:val="18"/>
+              </w:rPr>
+              <w:t>Gate稀疏、预算、Split/Spawn、父子守恒</w:t>
+            </w:r>
+          </w:p>
+        </w:tc>
+        <w:tc>
+          <w:tcPr>
+            <w:tcW w:type="dxa" w:w="3324"/>
+            <w:vAlign w:val="center"/>
+          </w:tcPr>
+          <w:p>
+            <w:pPr>
+              <w:jc w:val="left"/>
+            </w:pPr>
+            <w:r/>
+            <w:r>
+              <w:rPr>
+                <w:rFonts w:ascii="Microsoft YaHei" w:hAnsi="Microsoft YaHei" w:eastAsia="Microsoft YaHei"/>
+                <w:b w:val="0"/>
+                <w:sz w:val="18"/>
+              </w:rPr>
+              <w:t>控制哪些高斯删除、哪些区域增加</w:t>
+            </w:r>
+          </w:p>
+        </w:tc>
+      </w:tr>
+      <w:tr>
+        <w:tc>
+          <w:tcPr>
+            <w:tcW w:type="dxa" w:w="3324"/>
+            <w:vAlign w:val="center"/>
+          </w:tcPr>
+          <w:p>
+            <w:pPr>
+              <w:jc w:val="left"/>
+            </w:pPr>
+            <w:r/>
+            <w:r>
+              <w:rPr>
+                <w:rFonts w:ascii="Microsoft YaHei" w:hAnsi="Microsoft YaHei" w:eastAsia="Microsoft YaHei"/>
+                <w:b w:val="0"/>
+                <w:sz w:val="18"/>
+              </w:rPr>
+              <w:t>压缩部署</w:t>
+            </w:r>
+          </w:p>
+        </w:tc>
+        <w:tc>
+          <w:tcPr>
+            <w:tcW w:type="dxa" w:w="3324"/>
+            <w:vAlign w:val="center"/>
+          </w:tcPr>
+          <w:p>
+            <w:pPr>
+              <w:jc w:val="left"/>
+            </w:pPr>
+            <w:r/>
+            <w:r>
+              <w:rPr>
+                <w:rFonts w:ascii="Microsoft YaHei" w:hAnsi="Microsoft YaHei" w:eastAsia="Microsoft YaHei"/>
+                <w:b w:val="0"/>
+                <w:sz w:val="18"/>
+              </w:rPr>
+              <w:t>量化、蒸馏、外观正则</w:t>
+            </w:r>
+          </w:p>
+        </w:tc>
+        <w:tc>
+          <w:tcPr>
+            <w:tcW w:type="dxa" w:w="3324"/>
+            <w:vAlign w:val="center"/>
+          </w:tcPr>
+          <w:p>
+            <w:pPr>
+              <w:jc w:val="left"/>
+            </w:pPr>
+            <w:r/>
+            <w:r>
+              <w:rPr>
+                <w:rFonts w:ascii="Microsoft YaHei" w:hAnsi="Microsoft YaHei" w:eastAsia="Microsoft YaHei"/>
+                <w:b w:val="0"/>
+                <w:sz w:val="18"/>
+              </w:rPr>
+              <w:t>压缩后尽量保持原有渲染质量</w:t>
+            </w:r>
+          </w:p>
+        </w:tc>
+      </w:tr>
+    </w:tbl>
+    <w:p>
+      <w:pPr>
+        <w:spacing w:before="140" w:after="100"/>
+      </w:pPr>
+      <w:r>
+        <w:rPr>
+          <w:rFonts w:ascii="Microsoft YaHei" w:hAnsi="Microsoft YaHei" w:eastAsia="Microsoft YaHei"/>
+          <w:b/>
+          <w:sz w:val="26"/>
+        </w:rPr>
+        <w:t>21.1 统一符号</w:t>
+      </w:r>
+    </w:p>
+    <w:p>
+      <w:pPr>
+        <w:pStyle w:val="ListBullet"/>
+        <w:spacing w:after="40"/>
+      </w:pPr>
+      <w:r>
+        <w:rPr>
+          <w:rFonts w:ascii="Microsoft YaHei" w:hAnsi="Microsoft YaHei" w:eastAsia="Microsoft YaHei"/>
+          <w:b w:val="0"/>
+          <w:sz w:val="21"/>
+        </w:rPr>
+        <w:t>I：参考/真实图像；I_hat：高斯渲染图像；D、D_hat：参考与预测深度；A、A_hat：参考与预测Alpha。</w:t>
+      </w:r>
+    </w:p>
+    <w:p>
+      <w:pPr>
+        <w:pStyle w:val="ListBullet"/>
+        <w:spacing w:after="40"/>
+      </w:pPr>
+      <w:r>
+        <w:rPr>
+          <w:rFonts w:ascii="Microsoft YaHei" w:hAnsi="Microsoft YaHei" w:eastAsia="Microsoft YaHei"/>
+          <w:b w:val="0"/>
+          <w:sz w:val="21"/>
+        </w:rPr>
+        <w:t>E、T、M、C：深度边缘、细结构、材质类别和置信度；v表示一个相机视角；Ω表示有效像素集合。</w:t>
+      </w:r>
+    </w:p>
+    <w:p>
+      <w:pPr>
+        <w:pStyle w:val="ListBullet"/>
+        <w:spacing w:after="40"/>
+      </w:pPr>
+      <w:r>
+        <w:rPr>
+          <w:rFonts w:ascii="Microsoft YaHei" w:hAnsi="Microsoft YaHei" w:eastAsia="Microsoft YaHei"/>
+          <w:b w:val="0"/>
+          <w:sz w:val="21"/>
+        </w:rPr>
+        <w:t>g_i：第i个高斯的Gate；o_i：其Gaussian Opacity；c_i：它在预定多视角中的实际贡献；p_i：Split概率。</w:t>
+      </w:r>
+    </w:p>
+    <w:p>
+      <w:pPr>
+        <w:pStyle w:val="ListBullet"/>
+        <w:spacing w:after="40"/>
+      </w:pPr>
+      <w:r>
+        <w:rPr>
+          <w:rFonts w:ascii="Microsoft YaHei" w:hAnsi="Microsoft YaHei" w:eastAsia="Microsoft YaHei"/>
+          <w:b w:val="0"/>
+          <w:sz w:val="21"/>
+        </w:rPr>
+        <w:t>N表示有效像素或高斯数量；ε是防止除零的小常数；λ_x表示每项损失的权重。</w:t>
+      </w:r>
+    </w:p>
+    <w:p>
+      <w:pPr>
+        <w:spacing w:after="80"/>
+      </w:pPr>
+      <w:r>
+        <w:rPr>
+          <w:rFonts w:ascii="Microsoft YaHei" w:hAnsi="Microsoft YaHei" w:eastAsia="Microsoft YaHei"/>
+          <w:b/>
+          <w:sz w:val="21"/>
+        </w:rPr>
+        <w:t>注意：场景感知Alpha描述像素覆盖和软边界；Gaussian Opacity描述单个高斯的渲染贡献；Gate描述是否值得保留，三者不是同一个量。</w:t>
+      </w:r>
+    </w:p>
+    <w:p>
+      <w:pPr>
+        <w:spacing w:before="140" w:after="100"/>
+      </w:pPr>
+      <w:r>
+        <w:rPr>
+          <w:rFonts w:ascii="Microsoft YaHei" w:hAnsi="Microsoft YaHei" w:eastAsia="Microsoft YaHei"/>
+          <w:b/>
+          <w:sz w:val="26"/>
+        </w:rPr>
+        <w:t>21.2 场景感知与多任务Head损失</w:t>
+      </w:r>
+    </w:p>
+    <w:p>
+      <w:pPr>
+        <w:spacing w:after="80"/>
+      </w:pPr>
+      <w:r>
+        <w:rPr>
+          <w:rFonts w:ascii="Microsoft YaHei" w:hAnsi="Microsoft YaHei" w:eastAsia="Microsoft YaHei"/>
+          <w:b/>
+          <w:sz w:val="21"/>
+        </w:rPr>
+        <w:t>（1）基础深度/视差损失 L_depth：核心</w:t>
+      </w:r>
+    </w:p>
+    <w:p>
+      <w:pPr>
+        <w:spacing w:after="80"/>
+      </w:pPr>
+      <w:r>
+        <w:rPr>
+          <w:rFonts w:ascii="Microsoft YaHei" w:hAnsi="Microsoft YaHei" w:eastAsia="Microsoft YaHei"/>
+          <w:b w:val="0"/>
+          <w:sz w:val="21"/>
+        </w:rPr>
+        <w:t>作用：让第一层深度或视差接近参考几何。若尺度不稳定，可以使用对数域的尺度不变损失。</w:t>
+      </w:r>
+    </w:p>
+    <w:p>
+      <w:pPr>
+        <w:spacing w:after="100"/>
+        <w:ind w:left="360"/>
+      </w:pPr>
+      <w:r>
+        <w:rPr>
+          <w:rFonts w:ascii="Consolas" w:hAnsi="Consolas" w:eastAsia="Consolas"/>
+          <w:b w:val="0"/>
+          <w:sz w:val="20"/>
+        </w:rPr>
+        <w:t>e_p = log(D_hat_p) - log(D_p)</w:t>
+      </w:r>
+    </w:p>
+    <w:p>
+      <w:pPr>
+        <w:spacing w:after="100"/>
+        <w:ind w:left="360"/>
+      </w:pPr>
+      <w:r>
+        <w:rPr>
+          <w:rFonts w:ascii="Consolas" w:hAnsi="Consolas" w:eastAsia="Consolas"/>
+          <w:b w:val="0"/>
+          <w:sz w:val="20"/>
+        </w:rPr>
+        <w:t>L_depth-si = sqrt( mean(e_p^2) - λ_si * mean(e_p)^2 )</w:t>
+      </w:r>
+    </w:p>
+    <w:p>
+      <w:pPr>
+        <w:spacing w:after="80"/>
+      </w:pPr>
+      <w:r>
+        <w:rPr>
+          <w:rFonts w:ascii="Microsoft YaHei" w:hAnsi="Microsoft YaHei" w:eastAsia="Microsoft YaHei"/>
+          <w:b w:val="0"/>
+          <w:sz w:val="21"/>
+        </w:rPr>
+        <w:t>第一项惩罚逐像素深度误差，第二项减弱整张图统一尺度偏移的影响。若有可靠米制深度，也可以直接使用有效区域上的L1或Charbonnier损失。第二层隐藏深度通常没有直接真值，主要依靠新视角渲染、Depth Adjustment或多视图监督间接学习。</w:t>
+      </w:r>
+    </w:p>
+    <w:p>
+      <w:pPr>
+        <w:spacing w:after="80"/>
+      </w:pPr>
+      <w:r>
+        <w:rPr>
+          <w:rFonts w:ascii="Microsoft YaHei" w:hAnsi="Microsoft YaHei" w:eastAsia="Microsoft YaHei"/>
+          <w:b/>
+          <w:sz w:val="21"/>
+        </w:rPr>
+        <w:t>（2）深度梯度/边缘保持损失 L_depth-grad：推荐</w:t>
+      </w:r>
+    </w:p>
+    <w:p>
+      <w:pPr>
+        <w:spacing w:after="100"/>
+        <w:ind w:left="360"/>
+      </w:pPr>
+      <w:r>
+        <w:rPr>
+          <w:rFonts w:ascii="Consolas" w:hAnsi="Consolas" w:eastAsia="Consolas"/>
+          <w:b w:val="0"/>
+          <w:sz w:val="20"/>
+        </w:rPr>
+        <w:t>L_depth-grad = mean( |∇x log D_hat - ∇x log D| + |∇y log D_hat - ∇y log D| )</w:t>
+      </w:r>
+    </w:p>
+    <w:p>
+      <w:pPr>
+        <w:spacing w:after="80"/>
+      </w:pPr>
+      <w:r>
+        <w:rPr>
+          <w:rFonts w:ascii="Microsoft YaHei" w:hAnsi="Microsoft YaHei" w:eastAsia="Microsoft YaHei"/>
+          <w:b w:val="0"/>
+          <w:sz w:val="21"/>
+        </w:rPr>
+        <w:t>作用：不只要求深度数值接近，还要求前后景断层出现在正确位置，避免人物轮廓、花茎和栏杆附近被过度抹平。</w:t>
+      </w:r>
+    </w:p>
+    <w:p>
+      <w:pPr>
+        <w:spacing w:after="80"/>
+      </w:pPr>
+      <w:r>
+        <w:rPr>
+          <w:rFonts w:ascii="Microsoft YaHei" w:hAnsi="Microsoft YaHei" w:eastAsia="Microsoft YaHei"/>
+          <w:b/>
+          <w:sz w:val="21"/>
+        </w:rPr>
+        <w:t>（3）深度边缘损失 L_edge：核心</w:t>
+      </w:r>
+    </w:p>
+    <w:p>
+      <w:pPr>
+        <w:spacing w:after="100"/>
+        <w:ind w:left="360"/>
+      </w:pPr>
+      <w:r>
+        <w:rPr>
+          <w:rFonts w:ascii="Consolas" w:hAnsi="Consolas" w:eastAsia="Consolas"/>
+          <w:b w:val="0"/>
+          <w:sz w:val="20"/>
+        </w:rPr>
+        <w:t>L_BCE = -mean( E log(E_hat) + (1-E) log(1-E_hat) )</w:t>
+      </w:r>
+    </w:p>
+    <w:p>
+      <w:pPr>
+        <w:spacing w:after="100"/>
+        <w:ind w:left="360"/>
+      </w:pPr>
+      <w:r>
+        <w:rPr>
+          <w:rFonts w:ascii="Consolas" w:hAnsi="Consolas" w:eastAsia="Consolas"/>
+          <w:b w:val="0"/>
+          <w:sz w:val="20"/>
+        </w:rPr>
+        <w:t>L_Dice = 1 - (2 Σ(E_hat E) + ε) / (ΣE_hat + ΣE + ε)</w:t>
+      </w:r>
+    </w:p>
+    <w:p>
+      <w:pPr>
+        <w:spacing w:after="100"/>
+        <w:ind w:left="360"/>
+      </w:pPr>
+      <w:r>
+        <w:rPr>
+          <w:rFonts w:ascii="Consolas" w:hAnsi="Consolas" w:eastAsia="Consolas"/>
+          <w:b w:val="0"/>
+          <w:sz w:val="20"/>
+        </w:rPr>
+        <w:t>L_edge = L_BCE + λ_dice L_Dice</w:t>
+      </w:r>
+    </w:p>
+    <w:p>
+      <w:pPr>
+        <w:spacing w:after="80"/>
+      </w:pPr>
+      <w:r>
+        <w:rPr>
+          <w:rFonts w:ascii="Microsoft YaHei" w:hAnsi="Microsoft YaHei" w:eastAsia="Microsoft YaHei"/>
+          <w:b w:val="0"/>
+          <w:sz w:val="21"/>
+        </w:rPr>
+        <w:t>BCE逐像素判断是不是边缘；Dice关注整条细边是否完整，能缓解边缘像素远少于背景像素的问题。</w:t>
+      </w:r>
+    </w:p>
+    <w:p>
+      <w:pPr>
+        <w:spacing w:after="80"/>
+      </w:pPr>
+      <w:r>
+        <w:rPr>
+          <w:rFonts w:ascii="Microsoft YaHei" w:hAnsi="Microsoft YaHei" w:eastAsia="Microsoft YaHei"/>
+          <w:b/>
+          <w:sz w:val="21"/>
+        </w:rPr>
+        <w:t>（4）Alpha/Matte损失 L_alpha-head：核心</w:t>
+      </w:r>
+    </w:p>
+    <w:p>
+      <w:pPr>
+        <w:spacing w:after="100"/>
+        <w:ind w:left="360"/>
+      </w:pPr>
+      <w:r>
+        <w:rPr>
+          <w:rFonts w:ascii="Consolas" w:hAnsi="Consolas" w:eastAsia="Consolas"/>
+          <w:b w:val="0"/>
+          <w:sz w:val="20"/>
+        </w:rPr>
+        <w:t>L_alpha-head = mean( |A_hat - A| ) + λ_boundary mean( |∇A_hat - ∇A| )</w:t>
+      </w:r>
+    </w:p>
+    <w:p>
+      <w:pPr>
+        <w:spacing w:after="80"/>
+      </w:pPr>
+      <w:r>
+        <w:rPr>
+          <w:rFonts w:ascii="Microsoft YaHei" w:hAnsi="Microsoft YaHei" w:eastAsia="Microsoft YaHei"/>
+          <w:b w:val="0"/>
+          <w:sz w:val="21"/>
+        </w:rPr>
+        <w:t>第一项恢复覆盖程度，第二项保证软边界位置正确。若Alpha标签接近二值，也可加入BCE；对于发丝和半透明边缘，L1通常比强制二值化更自然。</w:t>
+      </w:r>
+    </w:p>
+    <w:p>
+      <w:pPr>
+        <w:spacing w:after="80"/>
+      </w:pPr>
+      <w:r>
+        <w:rPr>
+          <w:rFonts w:ascii="Microsoft YaHei" w:hAnsi="Microsoft YaHei" w:eastAsia="Microsoft YaHei"/>
+          <w:b/>
+          <w:sz w:val="21"/>
+        </w:rPr>
+        <w:t>（5）细结构概率损失 L_thin-head：核心</w:t>
+      </w:r>
+    </w:p>
+    <w:p>
+      <w:pPr>
+        <w:spacing w:after="100"/>
+        <w:ind w:left="360"/>
+      </w:pPr>
+      <w:r>
+        <w:rPr>
+          <w:rFonts w:ascii="Consolas" w:hAnsi="Consolas" w:eastAsia="Consolas"/>
+          <w:b w:val="0"/>
+          <w:sz w:val="20"/>
+        </w:rPr>
+        <w:t>L_focal = -mean( α_t (1-p_t)^γ log(p_t) )</w:t>
+      </w:r>
+    </w:p>
+    <w:p>
+      <w:pPr>
+        <w:spacing w:after="100"/>
+        <w:ind w:left="360"/>
+      </w:pPr>
+      <w:r>
+        <w:rPr>
+          <w:rFonts w:ascii="Consolas" w:hAnsi="Consolas" w:eastAsia="Consolas"/>
+          <w:b w:val="0"/>
+          <w:sz w:val="20"/>
+        </w:rPr>
+        <w:t>L_thin-head = L_focal + λ_thin-dice L_Dice(T_hat, T)</w:t>
+      </w:r>
+    </w:p>
+    <w:p>
+      <w:pPr>
+        <w:spacing w:after="80"/>
+      </w:pPr>
+      <w:r>
+        <w:rPr>
+          <w:rFonts w:ascii="Microsoft YaHei" w:hAnsi="Microsoft YaHei" w:eastAsia="Microsoft YaHei"/>
+          <w:b w:val="0"/>
+          <w:sz w:val="21"/>
+        </w:rPr>
+        <w:t>Focal Loss降低大量简单背景像素的权重，把训练集中到少量难识别的花茎、发丝、栏杆和辐条；Dice保证细线整体连通。</w:t>
+      </w:r>
+    </w:p>
+    <w:p>
+      <w:pPr>
+        <w:spacing w:after="80"/>
+      </w:pPr>
+      <w:r>
+        <w:rPr>
+          <w:rFonts w:ascii="Microsoft YaHei" w:hAnsi="Microsoft YaHei" w:eastAsia="Microsoft YaHei"/>
+          <w:b/>
+          <w:sz w:val="21"/>
+        </w:rPr>
+        <w:t>（6）材质分类损失 L_material：后期使用</w:t>
+      </w:r>
+    </w:p>
+    <w:p>
+      <w:pPr>
+        <w:spacing w:after="100"/>
+        <w:ind w:left="360"/>
+      </w:pPr>
+      <w:r>
+        <w:rPr>
+          <w:rFonts w:ascii="Consolas" w:hAnsi="Consolas" w:eastAsia="Consolas"/>
+          <w:b w:val="0"/>
+          <w:sz w:val="20"/>
+        </w:rPr>
+        <w:t>L_material = -mean( Σ_k y_k log softmax(m_hat)_k )</w:t>
+      </w:r>
+    </w:p>
+    <w:p>
+      <w:pPr>
+        <w:spacing w:after="80"/>
+      </w:pPr>
+      <w:r>
+        <w:rPr>
+          <w:rFonts w:ascii="Microsoft YaHei" w:hAnsi="Microsoft YaHei" w:eastAsia="Microsoft YaHei"/>
+          <w:b w:val="0"/>
+          <w:sz w:val="21"/>
+        </w:rPr>
+        <w:t>这是多类别交叉熵，判断普通漫反射、金属、玻璃、水面等类别。它主要控制外观模型复杂度，不应直接等同于增加高斯数量。</w:t>
+      </w:r>
+    </w:p>
+    <w:p>
+      <w:pPr>
+        <w:spacing w:after="80"/>
+      </w:pPr>
+      <w:r>
+        <w:rPr>
+          <w:rFonts w:ascii="Microsoft YaHei" w:hAnsi="Microsoft YaHei" w:eastAsia="Microsoft YaHei"/>
+          <w:b/>
+          <w:sz w:val="21"/>
+        </w:rPr>
+        <w:t>（7）置信度/不确定性损失 L_conf：推荐</w:t>
+      </w:r>
+    </w:p>
+    <w:p>
+      <w:pPr>
+        <w:spacing w:after="100"/>
+        <w:ind w:left="360"/>
+      </w:pPr>
+      <w:r>
+        <w:rPr>
+          <w:rFonts w:ascii="Consolas" w:hAnsi="Consolas" w:eastAsia="Consolas"/>
+          <w:b w:val="0"/>
+          <w:sz w:val="20"/>
+        </w:rPr>
+        <w:t>r_p = |D_hat_p - D_p|,    L_conf = mean( r_p exp(-s_p) + s_p )</w:t>
+      </w:r>
+    </w:p>
+    <w:p>
+      <w:pPr>
+        <w:spacing w:after="80"/>
+      </w:pPr>
+      <w:r>
+        <w:rPr>
+          <w:rFonts w:ascii="Microsoft YaHei" w:hAnsi="Microsoft YaHei" w:eastAsia="Microsoft YaHei"/>
+          <w:b w:val="0"/>
+          <w:sz w:val="21"/>
+        </w:rPr>
+        <w:t>s_p可以理解为网络预测的对数不确定性。误差大时允许不确定性升高，但+s_p又防止网络把所有位置都说成“不可信”。没有真实深度时，可用教师误差或多视角重投影误差构造置信度伪标签。</w:t>
+      </w:r>
+    </w:p>
+    <w:p>
+      <w:pPr>
+        <w:spacing w:before="140" w:after="100"/>
+      </w:pPr>
+      <w:r>
+        <w:rPr>
+          <w:rFonts w:ascii="Microsoft YaHei" w:hAnsi="Microsoft YaHei" w:eastAsia="Microsoft YaHei"/>
+          <w:b/>
+          <w:sz w:val="26"/>
+        </w:rPr>
+        <w:t>21.3 统一3DGS渲染质量损失</w:t>
+      </w:r>
+    </w:p>
+    <w:p>
+      <w:pPr>
+        <w:spacing w:after="80"/>
+      </w:pPr>
+      <w:r>
+        <w:rPr>
+          <w:rFonts w:ascii="Microsoft YaHei" w:hAnsi="Microsoft YaHei" w:eastAsia="Microsoft YaHei"/>
+          <w:b/>
+          <w:sz w:val="21"/>
+        </w:rPr>
+        <w:t>（1）RGB重建损失 L_RGB：核心</w:t>
+      </w:r>
+    </w:p>
+    <w:p>
+      <w:pPr>
+        <w:spacing w:after="100"/>
+        <w:ind w:left="360"/>
+      </w:pPr>
+      <w:r>
+        <w:rPr>
+          <w:rFonts w:ascii="Consolas" w:hAnsi="Consolas" w:eastAsia="Consolas"/>
+          <w:b w:val="0"/>
+          <w:sz w:val="20"/>
+        </w:rPr>
+        <w:t>L_RGB-L1 = (1/|Ω|) Σ_{p∈Ω} |I_hat_p - I_p|</w:t>
+      </w:r>
+    </w:p>
+    <w:p>
+      <w:pPr>
+        <w:spacing w:after="100"/>
+        <w:ind w:left="360"/>
+      </w:pPr>
+      <w:r>
+        <w:rPr>
+          <w:rFonts w:ascii="Consolas" w:hAnsi="Consolas" w:eastAsia="Consolas"/>
+          <w:b w:val="0"/>
+          <w:sz w:val="20"/>
+        </w:rPr>
+        <w:t>L_Charb = (1/|Ω|) Σ sqrt( (I_hat_p-I_p)^2 + ε^2 )</w:t>
+      </w:r>
+    </w:p>
+    <w:p>
+      <w:pPr>
+        <w:spacing w:after="80"/>
+      </w:pPr>
+      <w:r>
+        <w:rPr>
+          <w:rFonts w:ascii="Microsoft YaHei" w:hAnsi="Microsoft YaHei" w:eastAsia="Microsoft YaHei"/>
+          <w:b w:val="0"/>
+          <w:sz w:val="21"/>
+        </w:rPr>
+        <w:t>L1直接比较颜色；Charbonnier是平滑版L1，对少量异常像素更稳。它保证颜色基本正确，但单独使用容易得到平均化、偏模糊的结果。</w:t>
+      </w:r>
+    </w:p>
+    <w:p>
+      <w:pPr>
+        <w:spacing w:after="80"/>
+      </w:pPr>
+      <w:r>
+        <w:rPr>
+          <w:rFonts w:ascii="Microsoft YaHei" w:hAnsi="Microsoft YaHei" w:eastAsia="Microsoft YaHei"/>
+          <w:b/>
+          <w:sz w:val="21"/>
+        </w:rPr>
+        <w:t>（2）LPIPS感知损失 L_LPIPS：核心</w:t>
+      </w:r>
+    </w:p>
+    <w:p>
+      <w:pPr>
+        <w:spacing w:after="100"/>
+        <w:ind w:left="360"/>
+      </w:pPr>
+      <w:r>
+        <w:rPr>
+          <w:rFonts w:ascii="Consolas" w:hAnsi="Consolas" w:eastAsia="Consolas"/>
+          <w:b w:val="0"/>
+          <w:sz w:val="20"/>
+        </w:rPr>
+        <w:t>L_LPIPS = Σ_l (1/H_lW_l) Σ_{h,w} || w_l ⊙ (f_hat_l(h,w)-f_l(h,w)) ||_2^2</w:t>
+      </w:r>
+    </w:p>
+    <w:p>
+      <w:pPr>
+        <w:spacing w:after="80"/>
+      </w:pPr>
+      <w:r>
+        <w:rPr>
+          <w:rFonts w:ascii="Microsoft YaHei" w:hAnsi="Microsoft YaHei" w:eastAsia="Microsoft YaHei"/>
+          <w:b w:val="0"/>
+          <w:sz w:val="21"/>
+        </w:rPr>
+        <w:t>先把两张图送入固定的深度网络提取多层特征，再比较归一化特征差异。它更关注纹理、轮廓和语义结构是否相似，而不是要求每个像素完全相同。数值越小越好。</w:t>
+      </w:r>
+    </w:p>
+    <w:p>
+      <w:pPr>
+        <w:spacing w:after="80"/>
+      </w:pPr>
+      <w:r>
+        <w:rPr>
+          <w:rFonts w:ascii="Microsoft YaHei" w:hAnsi="Microsoft YaHei" w:eastAsia="Microsoft YaHei"/>
+          <w:b/>
+          <w:sz w:val="21"/>
+        </w:rPr>
+        <w:t>（3）DISTS损失 L_DISTS：与课题指标对齐时使用</w:t>
+      </w:r>
+    </w:p>
+    <w:p>
+      <w:pPr>
+        <w:spacing w:after="100"/>
+        <w:ind w:left="360"/>
+      </w:pPr>
+      <w:r>
+        <w:rPr>
+          <w:rFonts w:ascii="Consolas" w:hAnsi="Consolas" w:eastAsia="Consolas"/>
+          <w:b w:val="0"/>
+          <w:sz w:val="20"/>
+        </w:rPr>
+        <w:t>S_tex(j) = (2 μ_hat_j μ_j + c1) / (μ_hat_j^2 + μ_j^2 + c1)</w:t>
+      </w:r>
+    </w:p>
+    <w:p>
+      <w:pPr>
+        <w:spacing w:after="100"/>
+        <w:ind w:left="360"/>
+      </w:pPr>
+      <w:r>
+        <w:rPr>
+          <w:rFonts w:ascii="Consolas" w:hAnsi="Consolas" w:eastAsia="Consolas"/>
+          <w:b w:val="0"/>
+          <w:sz w:val="20"/>
+        </w:rPr>
+        <w:t>S_str(j) = (2 σ_hat,ref,j + c2) / (σ_hat,j^2 + σ_ref,j^2 + c2)</w:t>
+      </w:r>
+    </w:p>
+    <w:p>
+      <w:pPr>
+        <w:spacing w:after="100"/>
+        <w:ind w:left="360"/>
+      </w:pPr>
+      <w:r>
+        <w:rPr>
+          <w:rFonts w:ascii="Consolas" w:hAnsi="Consolas" w:eastAsia="Consolas"/>
+          <w:b w:val="0"/>
+          <w:sz w:val="20"/>
+        </w:rPr>
+        <w:t>DISTS = 1 - Σ_j [ α_j S_tex(j) + β_j S_str(j) ]</w:t>
+      </w:r>
+    </w:p>
+    <w:p>
+      <w:pPr>
+        <w:spacing w:after="80"/>
+      </w:pPr>
+      <w:r>
+        <w:rPr>
+          <w:rFonts w:ascii="Microsoft YaHei" w:hAnsi="Microsoft YaHei" w:eastAsia="Microsoft YaHei"/>
+          <w:b w:val="0"/>
+          <w:sz w:val="21"/>
+        </w:rPr>
+        <w:t>DISTS在预训练特征中同时比较纹理统计和结构相关性：均值相似项偏向纹理，协方差相似项偏向结构。权重α_j、β_j由DISTS模型学习并固定。作为损失时直接最小化DISTS；作为验收指标时仍要在独立测试集重新计算，不能把训练值当成最终结果。</w:t>
+      </w:r>
+    </w:p>
+    <w:p>
+      <w:pPr>
+        <w:spacing w:after="80"/>
+      </w:pPr>
+      <w:r>
+        <w:rPr>
+          <w:rFonts w:ascii="Microsoft YaHei" w:hAnsi="Microsoft YaHei" w:eastAsia="Microsoft YaHei"/>
+          <w:b/>
+          <w:sz w:val="21"/>
+        </w:rPr>
+        <w:t>（4）SSIM损失 L_SSIM：可选</w:t>
+      </w:r>
+    </w:p>
+    <w:p>
+      <w:pPr>
+        <w:spacing w:after="100"/>
+        <w:ind w:left="360"/>
+      </w:pPr>
+      <w:r>
+        <w:rPr>
+          <w:rFonts w:ascii="Consolas" w:hAnsi="Consolas" w:eastAsia="Consolas"/>
+          <w:b w:val="0"/>
+          <w:sz w:val="20"/>
+        </w:rPr>
+        <w:t>SSIM(x,y) = ((2μxμy+c1)(2σxy+c2))/((μx^2+μy^2+c1)(σx^2+σy^2+c2))</w:t>
+      </w:r>
+    </w:p>
+    <w:p>
+      <w:pPr>
+        <w:spacing w:after="100"/>
+        <w:ind w:left="360"/>
+      </w:pPr>
+      <w:r>
+        <w:rPr>
+          <w:rFonts w:ascii="Consolas" w:hAnsi="Consolas" w:eastAsia="Consolas"/>
+          <w:b w:val="0"/>
+          <w:sz w:val="20"/>
+        </w:rPr>
+        <w:t>L_SSIM = 1 - SSIM(I_hat, I)</w:t>
+      </w:r>
+    </w:p>
+    <w:p>
+      <w:pPr>
+        <w:spacing w:after="80"/>
+      </w:pPr>
+      <w:r>
+        <w:rPr>
+          <w:rFonts w:ascii="Microsoft YaHei" w:hAnsi="Microsoft YaHei" w:eastAsia="Microsoft YaHei"/>
+          <w:b w:val="0"/>
+          <w:sz w:val="21"/>
+        </w:rPr>
+        <w:t>SSIM比较局部亮度、对比度和结构，可作为辅助损失或评价指标；通常不需要与DISTS、LPIPS全部设置很大权重。</w:t>
+      </w:r>
+    </w:p>
+    <w:p>
+      <w:pPr>
+        <w:spacing w:after="80"/>
+      </w:pPr>
+      <w:r>
+        <w:rPr>
+          <w:rFonts w:ascii="Microsoft YaHei" w:hAnsi="Microsoft YaHei" w:eastAsia="Microsoft YaHei"/>
+          <w:b/>
+          <w:sz w:val="21"/>
+        </w:rPr>
+        <w:t>（5）渲染深度损失 L_render-depth：有目标深度时使用</w:t>
+      </w:r>
+    </w:p>
+    <w:p>
+      <w:pPr>
+        <w:spacing w:after="100"/>
+        <w:ind w:left="360"/>
+      </w:pPr>
+      <w:r>
+        <w:rPr>
+          <w:rFonts w:ascii="Consolas" w:hAnsi="Consolas" w:eastAsia="Consolas"/>
+          <w:b w:val="0"/>
+          <w:sz w:val="20"/>
+        </w:rPr>
+        <w:t>L_render-depth = Σ_p V_p |log D_hat_p - log D_p| / (Σ_p V_p + ε)</w:t>
+      </w:r>
+    </w:p>
+    <w:p>
+      <w:pPr>
+        <w:spacing w:after="80"/>
+      </w:pPr>
+      <w:r>
+        <w:rPr>
+          <w:rFonts w:ascii="Microsoft YaHei" w:hAnsi="Microsoft YaHei" w:eastAsia="Microsoft YaHei"/>
+          <w:b w:val="0"/>
+          <w:sz w:val="21"/>
+        </w:rPr>
+        <w:t>V是有效深度Mask。它约束统一高斯从目标视角渲染出的前后关系，而不仅是中心视角单目深度。</w:t>
+      </w:r>
+    </w:p>
+    <w:p>
+      <w:pPr>
+        <w:spacing w:after="80"/>
+      </w:pPr>
+      <w:r>
+        <w:rPr>
+          <w:rFonts w:ascii="Microsoft YaHei" w:hAnsi="Microsoft YaHei" w:eastAsia="Microsoft YaHei"/>
+          <w:b/>
+          <w:sz w:val="21"/>
+        </w:rPr>
+        <w:t>（6）渲染Alpha/覆盖损失 L_render-alpha：核心</w:t>
+      </w:r>
+    </w:p>
+    <w:p>
+      <w:pPr>
+        <w:spacing w:after="100"/>
+        <w:ind w:left="360"/>
+      </w:pPr>
+      <w:r>
+        <w:rPr>
+          <w:rFonts w:ascii="Consolas" w:hAnsi="Consolas" w:eastAsia="Consolas"/>
+          <w:b w:val="0"/>
+          <w:sz w:val="20"/>
+        </w:rPr>
+        <w:t>L_render-alpha = mean(|A_hat-A|)  或  BCE(A_hat,A)</w:t>
+      </w:r>
+    </w:p>
+    <w:p>
+      <w:pPr>
+        <w:spacing w:after="80"/>
+      </w:pPr>
+      <w:r>
+        <w:rPr>
+          <w:rFonts w:ascii="Microsoft YaHei" w:hAnsi="Microsoft YaHei" w:eastAsia="Microsoft YaHei"/>
+          <w:b w:val="0"/>
+          <w:sz w:val="21"/>
+        </w:rPr>
+        <w:t>它惩罚目标视角下的空洞、错误遮挡和覆盖不足。若没有真实Alpha，可从有效渲染区域、前景Matte或教师渲染构造监督。</w:t>
+      </w:r>
+    </w:p>
+    <w:p>
+      <w:pPr>
+        <w:spacing w:before="140" w:after="100"/>
+      </w:pPr>
+      <w:r>
+        <w:rPr>
+          <w:rFonts w:ascii="Microsoft YaHei" w:hAnsi="Microsoft YaHei" w:eastAsia="Microsoft YaHei"/>
+          <w:b/>
+          <w:sz w:val="26"/>
+        </w:rPr>
+        <w:t>21.4 显露区域补全损失</w:t>
+      </w:r>
+    </w:p>
+    <w:p>
+      <w:pPr>
+        <w:spacing w:after="80"/>
+      </w:pPr>
+      <w:r>
+        <w:rPr>
+          <w:rFonts w:ascii="Microsoft YaHei" w:hAnsi="Microsoft YaHei" w:eastAsia="Microsoft YaHei"/>
+          <w:b w:val="0"/>
+          <w:sz w:val="21"/>
+        </w:rPr>
+        <w:t>显露补全的损失只在显露Mask M内重点计算，避免网络修改原本可靠的可见区域。所有分母都加ε防止Mask为空。</w:t>
+      </w:r>
+    </w:p>
+    <w:p>
+      <w:pPr>
+        <w:spacing w:after="80"/>
+      </w:pPr>
+      <w:r>
+        <w:rPr>
+          <w:rFonts w:ascii="Microsoft YaHei" w:hAnsi="Microsoft YaHei" w:eastAsia="Microsoft YaHei"/>
+          <w:b/>
+          <w:sz w:val="21"/>
+        </w:rPr>
+        <w:t>（1）补全边缘损失 L_comp-edge：核心</w:t>
+      </w:r>
+    </w:p>
+    <w:p>
+      <w:pPr>
+        <w:spacing w:after="100"/>
+        <w:ind w:left="360"/>
+      </w:pPr>
+      <w:r>
+        <w:rPr>
+          <w:rFonts w:ascii="Consolas" w:hAnsi="Consolas" w:eastAsia="Consolas"/>
+          <w:b w:val="0"/>
+          <w:sz w:val="20"/>
+        </w:rPr>
+        <w:t>L_comp-edge = BCE(E_comp,E_gt; M) + λ_dice DiceLoss(E_comp,E_gt; M)</w:t>
+      </w:r>
+    </w:p>
+    <w:p>
+      <w:pPr>
+        <w:spacing w:after="80"/>
+      </w:pPr>
+      <w:r>
+        <w:rPr>
+          <w:rFonts w:ascii="Microsoft YaHei" w:hAnsi="Microsoft YaHei" w:eastAsia="Microsoft YaHei"/>
+          <w:b w:val="0"/>
+          <w:sz w:val="21"/>
+        </w:rPr>
+        <w:t>先保证遮挡后的墙面边界、栏杆方向和花茎连接关系延续正确。</w:t>
+      </w:r>
+    </w:p>
+    <w:p>
+      <w:pPr>
+        <w:spacing w:after="80"/>
+      </w:pPr>
+      <w:r>
+        <w:rPr>
+          <w:rFonts w:ascii="Microsoft YaHei" w:hAnsi="Microsoft YaHei" w:eastAsia="Microsoft YaHei"/>
+          <w:b/>
+          <w:sz w:val="21"/>
+        </w:rPr>
+        <w:t>（2）补全Depth损失 L_comp-depth：核心</w:t>
+      </w:r>
+    </w:p>
+    <w:p>
+      <w:pPr>
+        <w:spacing w:after="100"/>
+        <w:ind w:left="360"/>
+      </w:pPr>
+      <w:r>
+        <w:rPr>
+          <w:rFonts w:ascii="Consolas" w:hAnsi="Consolas" w:eastAsia="Consolas"/>
+          <w:b w:val="0"/>
+          <w:sz w:val="20"/>
+        </w:rPr>
+        <w:t>L_comp-depth = Σ_p M_p |log D_comp,p - log D_gt,p| / (Σ_p M_p + ε)</w:t>
+      </w:r>
+    </w:p>
+    <w:p>
+      <w:pPr>
+        <w:spacing w:after="80"/>
+      </w:pPr>
+      <w:r>
+        <w:rPr>
+          <w:rFonts w:ascii="Microsoft YaHei" w:hAnsi="Microsoft YaHei" w:eastAsia="Microsoft YaHei"/>
+          <w:b w:val="0"/>
+          <w:sz w:val="21"/>
+        </w:rPr>
+        <w:t>决定补充内容应放在前景还是背景。Depth错误会直接把补充高斯放到错误空间位置，因此通常比RGB误差更危险。</w:t>
+      </w:r>
+    </w:p>
+    <w:p>
+      <w:pPr>
+        <w:spacing w:after="80"/>
+      </w:pPr>
+      <w:r>
+        <w:rPr>
+          <w:rFonts w:ascii="Microsoft YaHei" w:hAnsi="Microsoft YaHei" w:eastAsia="Microsoft YaHei"/>
+          <w:b/>
+          <w:sz w:val="21"/>
+        </w:rPr>
+        <w:t>（3）补全RGB损失 L_comp-rgb：核心</w:t>
+      </w:r>
+    </w:p>
+    <w:p>
+      <w:pPr>
+        <w:spacing w:after="100"/>
+        <w:ind w:left="360"/>
+      </w:pPr>
+      <w:r>
+        <w:rPr>
+          <w:rFonts w:ascii="Consolas" w:hAnsi="Consolas" w:eastAsia="Consolas"/>
+          <w:b w:val="0"/>
+          <w:sz w:val="20"/>
+        </w:rPr>
+        <w:t>L_comp-rgb = Σ_p M_p |I_comp,p-I_gt,p|/(ΣM+ε) + λ_perc LPIPS(M⊙I_comp, M⊙I_gt)</w:t>
+      </w:r>
+    </w:p>
+    <w:p>
+      <w:pPr>
+        <w:spacing w:after="80"/>
+      </w:pPr>
+      <w:r>
+        <w:rPr>
+          <w:rFonts w:ascii="Microsoft YaHei" w:hAnsi="Microsoft YaHei" w:eastAsia="Microsoft YaHei"/>
+          <w:b w:val="0"/>
+          <w:sz w:val="21"/>
+        </w:rPr>
+        <w:t>L1保证颜色接近，LPIPS保证隐藏纹理和结构在感知上合理。</w:t>
+      </w:r>
+    </w:p>
+    <w:p>
+      <w:pPr>
+        <w:spacing w:after="80"/>
+      </w:pPr>
+      <w:r>
+        <w:rPr>
+          <w:rFonts w:ascii="Microsoft YaHei" w:hAnsi="Microsoft YaHei" w:eastAsia="Microsoft YaHei"/>
+          <w:b/>
+          <w:sz w:val="21"/>
+        </w:rPr>
+        <w:t>（4）补全Alpha损失 L_comp-alpha：核心</w:t>
+      </w:r>
+    </w:p>
+    <w:p>
+      <w:pPr>
+        <w:spacing w:after="100"/>
+        <w:ind w:left="360"/>
+      </w:pPr>
+      <w:r>
+        <w:rPr>
+          <w:rFonts w:ascii="Consolas" w:hAnsi="Consolas" w:eastAsia="Consolas"/>
+          <w:b w:val="0"/>
+          <w:sz w:val="20"/>
+        </w:rPr>
+        <w:t>L_comp-alpha = Σ_p M_p |A_comp,p-A_gt,p| / (Σ_p M_p + ε)</w:t>
+      </w:r>
+    </w:p>
+    <w:p>
+      <w:pPr>
+        <w:spacing w:after="80"/>
+      </w:pPr>
+      <w:r>
+        <w:rPr>
+          <w:rFonts w:ascii="Microsoft YaHei" w:hAnsi="Microsoft YaHei" w:eastAsia="Microsoft YaHei"/>
+          <w:b w:val="0"/>
+          <w:sz w:val="21"/>
+        </w:rPr>
+        <w:t>约束补充高斯的覆盖程度和软边界。生成高斯时可以用A_comp×Confidence初始化Opacity，但Alpha本身不等于最终Gaussian Opacity。</w:t>
+      </w:r>
+    </w:p>
+    <w:p>
+      <w:pPr>
+        <w:spacing w:after="80"/>
+      </w:pPr>
+      <w:r>
+        <w:rPr>
+          <w:rFonts w:ascii="Microsoft YaHei" w:hAnsi="Microsoft YaHei" w:eastAsia="Microsoft YaHei"/>
+          <w:b/>
+          <w:sz w:val="21"/>
+        </w:rPr>
+        <w:t>（5）补全置信度损失 L_comp-conf：推荐</w:t>
+      </w:r>
+    </w:p>
+    <w:p>
+      <w:pPr>
+        <w:spacing w:after="100"/>
+        <w:ind w:left="360"/>
+      </w:pPr>
+      <w:r>
+        <w:rPr>
+          <w:rFonts w:ascii="Consolas" w:hAnsi="Consolas" w:eastAsia="Consolas"/>
+          <w:b w:val="0"/>
+          <w:sz w:val="20"/>
+        </w:rPr>
+        <w:t>L_comp-conf = mean( r_comp exp(-s_comp) + s_comp )</w:t>
+      </w:r>
+    </w:p>
+    <w:p>
+      <w:pPr>
+        <w:spacing w:after="80"/>
+      </w:pPr>
+      <w:r>
+        <w:rPr>
+          <w:rFonts w:ascii="Microsoft YaHei" w:hAnsi="Microsoft YaHei" w:eastAsia="Microsoft YaHei"/>
+          <w:b w:val="0"/>
+          <w:sz w:val="21"/>
+        </w:rPr>
+        <w:t>r_comp可由RGB、Depth和Alpha补全误差组合。它让模型在无法可靠推断隐藏内容时降低置信度，而不是强行生成高不透明度高斯。</w:t>
+      </w:r>
+    </w:p>
+    <w:p>
+      <w:pPr>
+        <w:spacing w:after="80"/>
+      </w:pPr>
+      <w:r>
+        <w:rPr>
+          <w:rFonts w:ascii="Microsoft YaHei" w:hAnsi="Microsoft YaHei" w:eastAsia="Microsoft YaHei"/>
+          <w:b/>
+          <w:sz w:val="21"/>
+        </w:rPr>
+        <w:t>（6）三维重投影一致性 L_reproj：核心</w:t>
+      </w:r>
+    </w:p>
+    <w:p>
+      <w:pPr>
+        <w:spacing w:after="100"/>
+        <w:ind w:left="360"/>
+      </w:pPr>
+      <w:r>
+        <w:rPr>
+          <w:rFonts w:ascii="Consolas" w:hAnsi="Consolas" w:eastAsia="Consolas"/>
+          <w:b w:val="0"/>
+          <w:sz w:val="20"/>
+        </w:rPr>
+        <w:t>L_reproj = mean( |Render(BackProject(RGB-D-A_comp), v_b) - I_gt(v_b)| )</w:t>
+      </w:r>
+    </w:p>
+    <w:p>
+      <w:pPr>
+        <w:spacing w:after="80"/>
+      </w:pPr>
+      <w:r>
+        <w:rPr>
+          <w:rFonts w:ascii="Microsoft YaHei" w:hAnsi="Microsoft YaHei" w:eastAsia="Microsoft YaHei"/>
+          <w:b w:val="0"/>
+          <w:sz w:val="21"/>
+        </w:rPr>
+        <w:t>把一个端点补全出的RGB-D-Alpha反投影成高斯，再从另一个端点或中间视角渲染。若只在生成视角看起来正确、换视角就漂浮，重投影损失会变大。</w:t>
+      </w:r>
+    </w:p>
+    <w:p>
+      <w:pPr>
+        <w:spacing w:before="140" w:after="100"/>
+      </w:pPr>
+      <w:r>
+        <w:rPr>
+          <w:rFonts w:ascii="Microsoft YaHei" w:hAnsi="Microsoft YaHei" w:eastAsia="Microsoft YaHei"/>
+          <w:b/>
+          <w:sz w:val="26"/>
+        </w:rPr>
+        <w:t>21.5 双侧锚点与跨视角稳定损失</w:t>
+      </w:r>
+    </w:p>
+    <w:p>
+      <w:pPr>
+        <w:spacing w:after="80"/>
+      </w:pPr>
+      <w:r>
+        <w:rPr>
+          <w:rFonts w:ascii="Microsoft YaHei" w:hAnsi="Microsoft YaHei" w:eastAsia="Microsoft YaHei"/>
+          <w:b/>
+          <w:sz w:val="21"/>
+        </w:rPr>
+        <w:t>（1）双侧端点锚点损失 L_anchor：核心</w:t>
+      </w:r>
+    </w:p>
+    <w:p>
+      <w:pPr>
+        <w:spacing w:after="100"/>
+        <w:ind w:left="360"/>
+      </w:pPr>
+      <w:r>
+        <w:rPr>
+          <w:rFonts w:ascii="Consolas" w:hAnsi="Consolas" w:eastAsia="Consolas"/>
+          <w:b w:val="0"/>
+          <w:sz w:val="20"/>
+        </w:rPr>
+        <w:t>L_anchor = Σ_{v∈{left,right}} [ λ_rgb L_RGB(v) + λ_perc L_perc(v) + λ_d L_depth(v) + λ_a L_alpha(v) ]</w:t>
+      </w:r>
+    </w:p>
+    <w:p>
+      <w:pPr>
+        <w:spacing w:after="80"/>
+      </w:pPr>
+      <w:r>
+        <w:rPr>
+          <w:rFonts w:ascii="Microsoft YaHei" w:hAnsi="Microsoft YaHei" w:eastAsia="Microsoft YaHei"/>
+          <w:b w:val="0"/>
+          <w:sz w:val="21"/>
+        </w:rPr>
+        <w:t>同一组G_all必须同时在左端和右端正确。L_perc可选择DISTS或LPIPS，也可以两者小权重组合。锚点不是两套独立高斯，而是同一统一场景的两次检查。</w:t>
+      </w:r>
+    </w:p>
+    <w:p>
+      <w:pPr>
+        <w:spacing w:after="80"/>
+      </w:pPr>
+      <w:r>
+        <w:rPr>
+          <w:rFonts w:ascii="Microsoft YaHei" w:hAnsi="Microsoft YaHei" w:eastAsia="Microsoft YaHei"/>
+          <w:b/>
+          <w:sz w:val="21"/>
+        </w:rPr>
+        <w:t>（2）中间视角监督 L_mid：核心</w:t>
+      </w:r>
+    </w:p>
+    <w:p>
+      <w:pPr>
+        <w:spacing w:after="100"/>
+        <w:ind w:left="360"/>
+      </w:pPr>
+      <w:r>
+        <w:rPr>
+          <w:rFonts w:ascii="Consolas" w:hAnsi="Consolas" w:eastAsia="Consolas"/>
+          <w:b w:val="0"/>
+          <w:sz w:val="20"/>
+        </w:rPr>
+        <w:t>L_mid = (1/|V_mid|) Σ_{v∈V_mid} L_render(v)</w:t>
+      </w:r>
+    </w:p>
+    <w:p>
+      <w:pPr>
+        <w:spacing w:after="80"/>
+      </w:pPr>
+      <w:r>
+        <w:rPr>
+          <w:rFonts w:ascii="Microsoft YaHei" w:hAnsi="Microsoft YaHei" w:eastAsia="Microsoft YaHei"/>
+          <w:b w:val="0"/>
+          <w:sz w:val="21"/>
+        </w:rPr>
+        <w:t>只监督两个端点可能让中间路径不稳定，因此训练时还要随机采样端点之间的若干中间相机。</w:t>
+      </w:r>
+    </w:p>
+    <w:p>
+      <w:pPr>
+        <w:spacing w:after="80"/>
+      </w:pPr>
+      <w:r>
+        <w:rPr>
+          <w:rFonts w:ascii="Microsoft YaHei" w:hAnsi="Microsoft YaHei" w:eastAsia="Microsoft YaHei"/>
+          <w:b/>
+          <w:sz w:val="21"/>
+        </w:rPr>
+        <w:t>（3）视频/时间稳定损失 L_temp：可选</w:t>
+      </w:r>
+    </w:p>
+    <w:p>
+      <w:pPr>
+        <w:spacing w:after="100"/>
+        <w:ind w:left="360"/>
+      </w:pPr>
+      <w:r>
+        <w:rPr>
+          <w:rFonts w:ascii="Consolas" w:hAnsi="Consolas" w:eastAsia="Consolas"/>
+          <w:b w:val="0"/>
+          <w:sz w:val="20"/>
+        </w:rPr>
+        <w:t>L_temp = mean_t || I_hat_{t+1} - Warp(I_hat_t, Flow_{t→t+1}) ||_1</w:t>
+      </w:r>
+    </w:p>
+    <w:p>
+      <w:pPr>
+        <w:spacing w:after="80"/>
+      </w:pPr>
+      <w:r>
+        <w:rPr>
+          <w:rFonts w:ascii="Microsoft YaHei" w:hAnsi="Microsoft YaHei" w:eastAsia="Microsoft YaHei"/>
+          <w:b w:val="0"/>
+          <w:sz w:val="21"/>
+        </w:rPr>
+        <w:t>先用相机运动对应的光流或几何映射把相邻帧对齐，再比较差异。不能直接要求相邻帧完全相同，否则会压制正常运动视差。</w:t>
+      </w:r>
+    </w:p>
+    <w:p>
+      <w:pPr>
+        <w:spacing w:before="140" w:after="100"/>
+      </w:pPr>
+      <w:r>
+        <w:rPr>
+          <w:rFonts w:ascii="Microsoft YaHei" w:hAnsi="Microsoft YaHei" w:eastAsia="Microsoft YaHei"/>
+          <w:b/>
+          <w:sz w:val="26"/>
+        </w:rPr>
+        <w:t>21.6 Keep/Gate、Split与Spawn损失</w:t>
+      </w:r>
+    </w:p>
+    <w:p>
+      <w:pPr>
+        <w:spacing w:after="80"/>
+      </w:pPr>
+      <w:r>
+        <w:rPr>
+          <w:rFonts w:ascii="Microsoft YaHei" w:hAnsi="Microsoft YaHei" w:eastAsia="Microsoft YaHei"/>
+          <w:b/>
+          <w:sz w:val="21"/>
+        </w:rPr>
+        <w:t>（1）Soft Gate作用方式：不是独立损失，但决定梯度路径</w:t>
+      </w:r>
+    </w:p>
+    <w:p>
+      <w:pPr>
+        <w:spacing w:after="100"/>
+        <w:ind w:left="360"/>
+      </w:pPr>
+      <w:r>
+        <w:rPr>
+          <w:rFonts w:ascii="Consolas" w:hAnsi="Consolas" w:eastAsia="Consolas"/>
+          <w:b w:val="0"/>
+          <w:sz w:val="20"/>
+        </w:rPr>
+        <w:t>o_i^effective = o_i × g_i,    g_i = sigmoid(z_i) ∈ [0,1]</w:t>
+      </w:r>
+    </w:p>
+    <w:p>
+      <w:pPr>
+        <w:spacing w:after="80"/>
+      </w:pPr>
+      <w:r>
+        <w:rPr>
+          <w:rFonts w:ascii="Microsoft YaHei" w:hAnsi="Microsoft YaHei" w:eastAsia="Microsoft YaHei"/>
+          <w:b w:val="0"/>
+          <w:sz w:val="21"/>
+        </w:rPr>
+        <w:t>训练时Gate是连续软开关，渲染损失可以把梯度传回Gate Head；推理导出时才根据重要性阈值真正删除高斯。</w:t>
+      </w:r>
+    </w:p>
+    <w:p>
+      <w:pPr>
+        <w:spacing w:after="80"/>
+      </w:pPr>
+      <w:r>
+        <w:rPr>
+          <w:rFonts w:ascii="Microsoft YaHei" w:hAnsi="Microsoft YaHei" w:eastAsia="Microsoft YaHei"/>
+          <w:b/>
+          <w:sz w:val="21"/>
+        </w:rPr>
+        <w:t>（2）Gate稀疏损失 L_gate-sparse：核心</w:t>
+      </w:r>
+    </w:p>
+    <w:p>
+      <w:pPr>
+        <w:spacing w:after="100"/>
+        <w:ind w:left="360"/>
+      </w:pPr>
+      <w:r>
+        <w:rPr>
+          <w:rFonts w:ascii="Consolas" w:hAnsi="Consolas" w:eastAsia="Consolas"/>
+          <w:b w:val="0"/>
+          <w:sz w:val="20"/>
+        </w:rPr>
+        <w:t>L_gate-sparse = (1/N) Σ_i g_i</w:t>
+      </w:r>
+    </w:p>
+    <w:p>
+      <w:pPr>
+        <w:spacing w:after="80"/>
+      </w:pPr>
+      <w:r>
+        <w:rPr>
+          <w:rFonts w:ascii="Microsoft YaHei" w:hAnsi="Microsoft YaHei" w:eastAsia="Microsoft YaHei"/>
+          <w:b w:val="0"/>
+          <w:sz w:val="21"/>
+        </w:rPr>
+        <w:t>它鼓励Gate整体变小，避免所有高斯都保持开启。单独使用会把高斯全关掉，因此必须与渲染损失共同训练。</w:t>
+      </w:r>
+    </w:p>
+    <w:p>
+      <w:pPr>
+        <w:spacing w:after="80"/>
+      </w:pPr>
+      <w:r>
+        <w:rPr>
+          <w:rFonts w:ascii="Microsoft YaHei" w:hAnsi="Microsoft YaHei" w:eastAsia="Microsoft YaHei"/>
+          <w:b/>
+          <w:sz w:val="21"/>
+        </w:rPr>
+        <w:t>（3）目标预算损失 L_budget：推荐</w:t>
+      </w:r>
+    </w:p>
+    <w:p>
+      <w:pPr>
+        <w:spacing w:after="100"/>
+        <w:ind w:left="360"/>
+      </w:pPr>
+      <w:r>
+        <w:rPr>
+          <w:rFonts w:ascii="Consolas" w:hAnsi="Consolas" w:eastAsia="Consolas"/>
+          <w:b w:val="0"/>
+          <w:sz w:val="20"/>
+        </w:rPr>
+        <w:t>N_soft = Σ_i g_i,    L_budget = ((N_soft-N_target)/N_target)^2</w:t>
+      </w:r>
+    </w:p>
+    <w:p>
+      <w:pPr>
+        <w:spacing w:after="80"/>
+      </w:pPr>
+      <w:r>
+        <w:rPr>
+          <w:rFonts w:ascii="Microsoft YaHei" w:hAnsi="Microsoft YaHei" w:eastAsia="Microsoft YaHei"/>
+          <w:b w:val="0"/>
+          <w:sz w:val="21"/>
+        </w:rPr>
+        <w:t>相比单纯L1稀疏，预算损失直接要求有效高斯数量接近目标，例如希望保留50%。也可以只惩罚超预算部分：max(0,N_soft-N_target)^2。</w:t>
+      </w:r>
+    </w:p>
+    <w:p>
+      <w:pPr>
+        <w:spacing w:after="80"/>
+      </w:pPr>
+      <w:r>
+        <w:rPr>
+          <w:rFonts w:ascii="Microsoft YaHei" w:hAnsi="Microsoft YaHei" w:eastAsia="Microsoft YaHei"/>
+          <w:b/>
+          <w:sz w:val="21"/>
+        </w:rPr>
+        <w:t>（4）多视角贡献保护 L_contrib：推荐</w:t>
+      </w:r>
+    </w:p>
+    <w:p>
+      <w:pPr>
+        <w:spacing w:after="100"/>
+        <w:ind w:left="360"/>
+      </w:pPr>
+      <w:r>
+        <w:rPr>
+          <w:rFonts w:ascii="Consolas" w:hAnsi="Consolas" w:eastAsia="Consolas"/>
+          <w:b w:val="0"/>
+          <w:sz w:val="20"/>
+        </w:rPr>
+        <w:t>c_i = Σ_v contribution(i,v),    L_contrib = Σ_i stopgrad(c_i) (1-g_i)</w:t>
+      </w:r>
+    </w:p>
+    <w:p>
+      <w:pPr>
+        <w:spacing w:after="80"/>
+      </w:pPr>
+      <w:r>
+        <w:rPr>
+          <w:rFonts w:ascii="Microsoft YaHei" w:hAnsi="Microsoft YaHei" w:eastAsia="Microsoft YaHei"/>
+          <w:b w:val="0"/>
+          <w:sz w:val="21"/>
+        </w:rPr>
+        <w:t>若某高斯在左右端点确实有贡献，关闭它会受到惩罚。stopgrad表示贡献统计只作为权重，不让网络通过篡改统计值逃避约束。</w:t>
+      </w:r>
+    </w:p>
+    <w:p>
+      <w:pPr>
+        <w:spacing w:after="80"/>
+      </w:pPr>
+      <w:r>
+        <w:rPr>
+          <w:rFonts w:ascii="Microsoft YaHei" w:hAnsi="Microsoft YaHei" w:eastAsia="Microsoft YaHei"/>
+          <w:b/>
+          <w:sz w:val="21"/>
+        </w:rPr>
+        <w:t>（5）细结构局部加权损失 L_thin-render：核心</w:t>
+      </w:r>
+    </w:p>
+    <w:p>
+      <w:pPr>
+        <w:spacing w:after="100"/>
+        <w:ind w:left="360"/>
+      </w:pPr>
+      <w:r>
+        <w:rPr>
+          <w:rFonts w:ascii="Consolas" w:hAnsi="Consolas" w:eastAsia="Consolas"/>
+          <w:b w:val="0"/>
+          <w:sz w:val="20"/>
+        </w:rPr>
+        <w:t>W_p = 1 + λ_T T_p + λ_A |∇A_p| + λ_E E_p</w:t>
+      </w:r>
+    </w:p>
+    <w:p>
+      <w:pPr>
+        <w:spacing w:after="100"/>
+        <w:ind w:left="360"/>
+      </w:pPr>
+      <w:r>
+        <w:rPr>
+          <w:rFonts w:ascii="Consolas" w:hAnsi="Consolas" w:eastAsia="Consolas"/>
+          <w:b w:val="0"/>
+          <w:sz w:val="20"/>
+        </w:rPr>
+        <w:t>L_thin-render = mean( W_p × |I_hat_p-I_p| )</w:t>
+      </w:r>
+    </w:p>
+    <w:p>
+      <w:pPr>
+        <w:spacing w:after="80"/>
+      </w:pPr>
+      <w:r>
+        <w:rPr>
+          <w:rFonts w:ascii="Microsoft YaHei" w:hAnsi="Microsoft YaHei" w:eastAsia="Microsoft YaHei"/>
+          <w:b w:val="0"/>
+          <w:sz w:val="21"/>
+        </w:rPr>
+        <w:t>花茎、发丝、栏杆、辐条和软边界的像素获得更大权重。如果不Split导致这些区域模糊或断裂，梯度会推动Split概率上升。</w:t>
+      </w:r>
+    </w:p>
+    <w:p>
+      <w:pPr>
+        <w:spacing w:after="80"/>
+      </w:pPr>
+      <w:r>
+        <w:rPr>
+          <w:rFonts w:ascii="Microsoft YaHei" w:hAnsi="Microsoft YaHei" w:eastAsia="Microsoft YaHei"/>
+          <w:b/>
+          <w:sz w:val="21"/>
+        </w:rPr>
+        <w:t>（6）Split数量预算 L_split-budget：核心</w:t>
+      </w:r>
+    </w:p>
+    <w:p>
+      <w:pPr>
+        <w:spacing w:after="100"/>
+        <w:ind w:left="360"/>
+      </w:pPr>
+      <w:r>
+        <w:rPr>
+          <w:rFonts w:ascii="Consolas" w:hAnsi="Consolas" w:eastAsia="Consolas"/>
+          <w:b w:val="0"/>
+          <w:sz w:val="20"/>
+        </w:rPr>
+        <w:t>L_split-budget = (1/N) Σ_i p_i   或   ((Σ_i K p_i - N_split,target)/N_split,target)^2</w:t>
+      </w:r>
+    </w:p>
+    <w:p>
+      <w:pPr>
+        <w:spacing w:after="80"/>
+      </w:pPr>
+      <w:r>
+        <w:rPr>
+          <w:rFonts w:ascii="Microsoft YaHei" w:hAnsi="Microsoft YaHei" w:eastAsia="Microsoft YaHei"/>
+          <w:b w:val="0"/>
+          <w:sz w:val="21"/>
+        </w:rPr>
+        <w:t>K是每个父高斯最多激活的子高斯槽位数。它防止所有细结构候选都无限拆分。</w:t>
+      </w:r>
+    </w:p>
+    <w:p>
+      <w:pPr>
+        <w:spacing w:after="80"/>
+      </w:pPr>
+      <w:r>
+        <w:rPr>
+          <w:rFonts w:ascii="Microsoft YaHei" w:hAnsi="Microsoft YaHei" w:eastAsia="Microsoft YaHei"/>
+          <w:b/>
+          <w:sz w:val="21"/>
+        </w:rPr>
+        <w:t>（7）父子透明度/覆盖守恒 L_parent-child：推荐</w:t>
+      </w:r>
+    </w:p>
+    <w:p>
+      <w:pPr>
+        <w:spacing w:after="100"/>
+        <w:ind w:left="360"/>
+      </w:pPr>
+      <w:r>
+        <w:rPr>
+          <w:rFonts w:ascii="Consolas" w:hAnsi="Consolas" w:eastAsia="Consolas"/>
+          <w:b w:val="0"/>
+          <w:sz w:val="20"/>
+        </w:rPr>
+        <w:t>α_children = 1 - Π_j(1-α_child,j)</w:t>
+      </w:r>
+    </w:p>
+    <w:p>
+      <w:pPr>
+        <w:spacing w:after="100"/>
+        <w:ind w:left="360"/>
+      </w:pPr>
+      <w:r>
+        <w:rPr>
+          <w:rFonts w:ascii="Consolas" w:hAnsi="Consolas" w:eastAsia="Consolas"/>
+          <w:b w:val="0"/>
+          <w:sz w:val="20"/>
+        </w:rPr>
+        <w:t>L_parent-child = |α_parent - α_children|</w:t>
+      </w:r>
+    </w:p>
+    <w:p>
+      <w:pPr>
+        <w:spacing w:after="80"/>
+      </w:pPr>
+      <w:r>
+        <w:rPr>
+          <w:rFonts w:ascii="Microsoft YaHei" w:hAnsi="Microsoft YaHei" w:eastAsia="Microsoft YaHei"/>
+          <w:b w:val="0"/>
+          <w:sz w:val="21"/>
+        </w:rPr>
+        <w:t>父高斯拆成多个子高斯时，不能让所有子高斯都复制父Opacity，否则局部会突然变实或变亮。该损失让子高斯合成后的总覆盖接近父高斯。</w:t>
+      </w:r>
+    </w:p>
+    <w:p>
+      <w:pPr>
+        <w:spacing w:after="80"/>
+      </w:pPr>
+      <w:r>
+        <w:rPr>
+          <w:rFonts w:ascii="Microsoft YaHei" w:hAnsi="Microsoft YaHei" w:eastAsia="Microsoft YaHei"/>
+          <w:b/>
+          <w:sz w:val="21"/>
+        </w:rPr>
+        <w:t>（8）Split偏移与尺度正则 L_split-geom：推荐</w:t>
+      </w:r>
+    </w:p>
+    <w:p>
+      <w:pPr>
+        <w:spacing w:after="100"/>
+        <w:ind w:left="360"/>
+      </w:pPr>
+      <w:r>
+        <w:rPr>
+          <w:rFonts w:ascii="Consolas" w:hAnsi="Consolas" w:eastAsia="Consolas"/>
+          <w:b w:val="0"/>
+          <w:sz w:val="20"/>
+        </w:rPr>
+        <w:t>L_offset = Σ_i p_i ||Δμ_i||_2^2</w:t>
+      </w:r>
+    </w:p>
+    <w:p>
+      <w:pPr>
+        <w:spacing w:after="100"/>
+        <w:ind w:left="360"/>
+      </w:pPr>
+      <w:r>
+        <w:rPr>
+          <w:rFonts w:ascii="Consolas" w:hAnsi="Consolas" w:eastAsia="Consolas"/>
+          <w:b w:val="0"/>
+          <w:sz w:val="20"/>
+        </w:rPr>
+        <w:t>L_scale = Σ_i p_i [max(0,s_min-s_i)^2 + max(0,s_i-s_max)^2]</w:t>
+      </w:r>
+    </w:p>
+    <w:p>
+      <w:pPr>
+        <w:spacing w:after="80"/>
+      </w:pPr>
+      <w:r>
+        <w:rPr>
+          <w:rFonts w:ascii="Microsoft YaHei" w:hAnsi="Microsoft YaHei" w:eastAsia="Microsoft YaHei"/>
+          <w:b w:val="0"/>
+          <w:sz w:val="21"/>
+        </w:rPr>
+        <w:t>限制子高斯不要跑出父高斯局部范围，也不要缩得过小产生噪声或过大失去Split意义。细结构方向可由T的局部切线或Split Head预测。</w:t>
+      </w:r>
+    </w:p>
+    <w:p>
+      <w:pPr>
+        <w:spacing w:after="80"/>
+      </w:pPr>
+      <w:r>
+        <w:rPr>
+          <w:rFonts w:ascii="Microsoft YaHei" w:hAnsi="Microsoft YaHei" w:eastAsia="Microsoft YaHei"/>
+          <w:b/>
+          <w:sz w:val="21"/>
+        </w:rPr>
+        <w:t>（9）Spawn数量与置信度正则 L_spawn：核心</w:t>
+      </w:r>
+    </w:p>
+    <w:p>
+      <w:pPr>
+        <w:spacing w:after="100"/>
+        <w:ind w:left="360"/>
+      </w:pPr>
+      <w:r>
+        <w:rPr>
+          <w:rFonts w:ascii="Consolas" w:hAnsi="Consolas" w:eastAsia="Consolas"/>
+          <w:b w:val="0"/>
+          <w:sz w:val="20"/>
+        </w:rPr>
+        <w:t>L_spawn = λ_count Σ_j g_spawn,j + λ_uncertain Σ_j (1-C_comp,j) g_spawn,j</w:t>
+      </w:r>
+    </w:p>
+    <w:p>
+      <w:pPr>
+        <w:spacing w:after="80"/>
+      </w:pPr>
+      <w:r>
+        <w:rPr>
+          <w:rFonts w:ascii="Microsoft YaHei" w:hAnsi="Microsoft YaHei" w:eastAsia="Microsoft YaHei"/>
+          <w:b w:val="0"/>
+          <w:sz w:val="21"/>
+        </w:rPr>
+        <w:t>第一项限制补充高斯数量，第二项惩罚在低置信度隐藏区域生成高Gate高斯，减少错误补全形成的漂浮物。</w:t>
+      </w:r>
+    </w:p>
+    <w:p>
+      <w:pPr>
+        <w:spacing w:after="80"/>
+      </w:pPr>
+      <w:r>
+        <w:rPr>
+          <w:rFonts w:ascii="Microsoft YaHei" w:hAnsi="Microsoft YaHei" w:eastAsia="Microsoft YaHei"/>
+          <w:b/>
+          <w:sz w:val="21"/>
+        </w:rPr>
+        <w:t>（10）重复高斯正则 L_duplicate：可选</w:t>
+      </w:r>
+    </w:p>
+    <w:p>
+      <w:pPr>
+        <w:spacing w:after="100"/>
+        <w:ind w:left="360"/>
+      </w:pPr>
+      <w:r>
+        <w:rPr>
+          <w:rFonts w:ascii="Consolas" w:hAnsi="Consolas" w:eastAsia="Consolas"/>
+          <w:b w:val="0"/>
+          <w:sz w:val="20"/>
+        </w:rPr>
+        <w:t>L_duplicate = Σ_{(i,j)∈P} exp(-||μ_i-μ_j||^2/σ^2) × similarity(color_i,color_j)</w:t>
+      </w:r>
+    </w:p>
+    <w:p>
+      <w:pPr>
+        <w:spacing w:after="80"/>
+      </w:pPr>
+      <w:r>
+        <w:rPr>
+          <w:rFonts w:ascii="Microsoft YaHei" w:hAnsi="Microsoft YaHei" w:eastAsia="Microsoft YaHei"/>
+          <w:b w:val="0"/>
+          <w:sz w:val="21"/>
+        </w:rPr>
+        <w:t>P只选择属于同一表面且位置、颜色非常接近的候选。该项用于减少G_base、G_split和G_supp重复堆叠；不能对所有邻近高斯无差别排斥，否则会破坏正常Alpha合成。</w:t>
+      </w:r>
+    </w:p>
+    <w:p>
+      <w:pPr>
+        <w:spacing w:before="140" w:after="100"/>
+      </w:pPr>
+      <w:r>
+        <w:rPr>
+          <w:rFonts w:ascii="Microsoft YaHei" w:hAnsi="Microsoft YaHei" w:eastAsia="Microsoft YaHei"/>
+          <w:b/>
+          <w:sz w:val="26"/>
+        </w:rPr>
+        <w:t>21.7 材质、量化与蒸馏损失</w:t>
+      </w:r>
+    </w:p>
+    <w:p>
+      <w:pPr>
+        <w:spacing w:after="80"/>
+      </w:pPr>
+      <w:r>
+        <w:rPr>
+          <w:rFonts w:ascii="Microsoft YaHei" w:hAnsi="Microsoft YaHei" w:eastAsia="Microsoft YaHei"/>
+          <w:b/>
+          <w:sz w:val="21"/>
+        </w:rPr>
+        <w:t>（1）视角相关外观正则 L_view-app：后期可选</w:t>
+      </w:r>
+    </w:p>
+    <w:p>
+      <w:pPr>
+        <w:spacing w:after="100"/>
+        <w:ind w:left="360"/>
+      </w:pPr>
+      <w:r>
+        <w:rPr>
+          <w:rFonts w:ascii="Consolas" w:hAnsi="Consolas" w:eastAsia="Consolas"/>
+          <w:b w:val="0"/>
+          <w:sz w:val="20"/>
+        </w:rPr>
+        <w:t>L_view-app = Σ_i (1-M_complex,i) ||a_view,i||_2^2</w:t>
+      </w:r>
+    </w:p>
+    <w:p>
+      <w:pPr>
+        <w:spacing w:after="80"/>
+      </w:pPr>
+      <w:r>
+        <w:rPr>
+          <w:rFonts w:ascii="Microsoft YaHei" w:hAnsi="Microsoft YaHei" w:eastAsia="Microsoft YaHei"/>
+          <w:b w:val="0"/>
+          <w:sz w:val="21"/>
+        </w:rPr>
+        <w:t>普通材质区域惩罚额外视角相关参数，使其退化为固定RGB；只有复杂材质区域允许使用更高外观容量。</w:t>
+      </w:r>
+    </w:p>
+    <w:p>
+      <w:pPr>
+        <w:spacing w:after="80"/>
+      </w:pPr>
+      <w:r>
+        <w:rPr>
+          <w:rFonts w:ascii="Microsoft YaHei" w:hAnsi="Microsoft YaHei" w:eastAsia="Microsoft YaHei"/>
+          <w:b/>
+          <w:sz w:val="21"/>
+        </w:rPr>
+        <w:t>（2）量化感知损失 L_quant：压缩阶段使用</w:t>
+      </w:r>
+    </w:p>
+    <w:p>
+      <w:pPr>
+        <w:spacing w:after="100"/>
+        <w:ind w:left="360"/>
+      </w:pPr>
+      <w:r>
+        <w:rPr>
+          <w:rFonts w:ascii="Consolas" w:hAnsi="Consolas" w:eastAsia="Consolas"/>
+          <w:b w:val="0"/>
+          <w:sz w:val="20"/>
+        </w:rPr>
+        <w:t>L_quant-param = Σ_i ||θ_i - Q(θ_i)||_2^2</w:t>
+      </w:r>
+    </w:p>
+    <w:p>
+      <w:pPr>
+        <w:spacing w:after="100"/>
+        <w:ind w:left="360"/>
+      </w:pPr>
+      <w:r>
+        <w:rPr>
+          <w:rFonts w:ascii="Consolas" w:hAnsi="Consolas" w:eastAsia="Consolas"/>
+          <w:b w:val="0"/>
+          <w:sz w:val="20"/>
+        </w:rPr>
+        <w:t>L_quant-render = LPIPS(Render(Q(G)), Render(G)) + λ_rgb L1(Render(Q(G)),Render(G))</w:t>
+      </w:r>
+    </w:p>
+    <w:p>
+      <w:pPr>
+        <w:spacing w:after="80"/>
+      </w:pPr>
+      <w:r>
+        <w:rPr>
+          <w:rFonts w:ascii="Microsoft YaHei" w:hAnsi="Microsoft YaHei" w:eastAsia="Microsoft YaHei"/>
+          <w:b w:val="0"/>
+          <w:sz w:val="21"/>
+        </w:rPr>
+        <w:t>第一项限制参数量化误差，第二项直接比较量化前后渲染结果。Q表示位置、尺度、旋转、Opacity和外观参数的低比特量化。</w:t>
+      </w:r>
+    </w:p>
+    <w:p>
+      <w:pPr>
+        <w:spacing w:after="80"/>
+      </w:pPr>
+      <w:r>
+        <w:rPr>
+          <w:rFonts w:ascii="Microsoft YaHei" w:hAnsi="Microsoft YaHei" w:eastAsia="Microsoft YaHei"/>
+          <w:b/>
+          <w:sz w:val="21"/>
+        </w:rPr>
+        <w:t>（3）教师蒸馏损失 L_distill：可选</w:t>
+      </w:r>
+    </w:p>
+    <w:p>
+      <w:pPr>
+        <w:spacing w:after="100"/>
+        <w:ind w:left="360"/>
+      </w:pPr>
+      <w:r>
+        <w:rPr>
+          <w:rFonts w:ascii="Consolas" w:hAnsi="Consolas" w:eastAsia="Consolas"/>
+          <w:b w:val="0"/>
+          <w:sz w:val="20"/>
+        </w:rPr>
+        <w:t>L_distill = λ_rgb ||I_student-I_teacher||_1 + λ_p LPIPS(I_student,I_teacher) + λ_d DISTS(I_student,I_teacher)</w:t>
+      </w:r>
+    </w:p>
+    <w:p>
+      <w:pPr>
+        <w:spacing w:after="80"/>
+      </w:pPr>
+      <w:r>
+        <w:rPr>
+          <w:rFonts w:ascii="Microsoft YaHei" w:hAnsi="Microsoft YaHei" w:eastAsia="Microsoft YaHei"/>
+          <w:b w:val="0"/>
+          <w:sz w:val="21"/>
+        </w:rPr>
+        <w:t>教师可以是完整118万高斯SHARP、多视图优化3DGS或未量化模型；学生用更少高斯逼近教师在目标浅视角范围内的渲染。</w:t>
+      </w:r>
+    </w:p>
+    <w:p>
+      <w:pPr>
+        <w:spacing w:before="140" w:after="100"/>
+      </w:pPr>
+      <w:r>
+        <w:rPr>
+          <w:rFonts w:ascii="Microsoft YaHei" w:hAnsi="Microsoft YaHei" w:eastAsia="Microsoft YaHei"/>
+          <w:b/>
+          <w:sz w:val="26"/>
+        </w:rPr>
+        <w:t>21.8 总损失如何组合</w:t>
+      </w:r>
+    </w:p>
+    <w:p>
+      <w:pPr>
+        <w:spacing w:after="100"/>
+        <w:ind w:left="360"/>
+      </w:pPr>
+      <w:r>
+        <w:rPr>
+          <w:rFonts w:ascii="Consolas" w:hAnsi="Consolas" w:eastAsia="Consolas"/>
+          <w:b w:val="0"/>
+          <w:sz w:val="20"/>
+        </w:rPr>
+        <w:t>L_total = L_scene + L_render + L_completion + L_anchor + L_adaptive + L_compress</w:t>
+      </w:r>
+    </w:p>
+    <w:p>
+      <w:pPr>
+        <w:spacing w:after="100"/>
+        <w:ind w:left="360"/>
+      </w:pPr>
+      <w:r>
+        <w:rPr>
+          <w:rFonts w:ascii="Consolas" w:hAnsi="Consolas" w:eastAsia="Consolas"/>
+          <w:b w:val="0"/>
+          <w:sz w:val="20"/>
+        </w:rPr>
+        <w:t>L_scene = λ_d L_depth + λ_e L_edge + λ_a L_alpha-head + λ_t L_thin-head + λ_m L_material + λ_c L_conf</w:t>
+      </w:r>
+    </w:p>
+    <w:p>
+      <w:pPr>
+        <w:spacing w:after="100"/>
+        <w:ind w:left="360"/>
+      </w:pPr>
+      <w:r>
+        <w:rPr>
+          <w:rFonts w:ascii="Consolas" w:hAnsi="Consolas" w:eastAsia="Consolas"/>
+          <w:b w:val="0"/>
+          <w:sz w:val="20"/>
+        </w:rPr>
+        <w:t>L_render = λ_rgb L_RGB + λ_lp L_LPIPS + λ_di L_DISTS + λ_rd L_render-depth + λ_ra L_render-alpha</w:t>
+      </w:r>
+    </w:p>
+    <w:p>
+      <w:pPr>
+        <w:spacing w:after="100"/>
+        <w:ind w:left="360"/>
+      </w:pPr>
+      <w:r>
+        <w:rPr>
+          <w:rFonts w:ascii="Consolas" w:hAnsi="Consolas" w:eastAsia="Consolas"/>
+          <w:b w:val="0"/>
+          <w:sz w:val="20"/>
+        </w:rPr>
+        <w:t>L_completion = λ_ce L_comp-edge + λ_cd L_comp-depth + λ_cr L_comp-rgb + λ_ca L_comp-alpha + λ_rp L_reproj</w:t>
+      </w:r>
+    </w:p>
+    <w:p>
+      <w:pPr>
+        <w:spacing w:after="100"/>
+        <w:ind w:left="360"/>
+      </w:pPr>
+      <w:r>
+        <w:rPr>
+          <w:rFonts w:ascii="Consolas" w:hAnsi="Consolas" w:eastAsia="Consolas"/>
+          <w:b w:val="0"/>
+          <w:sz w:val="20"/>
+        </w:rPr>
+        <w:t>L_adaptive = λ_g L_gate-sparse + λ_b L_budget + λ_s L_split-budget + λ_pc L_parent-child + λ_sp L_spawn</w:t>
+      </w:r>
+    </w:p>
+    <w:p>
+      <w:pPr>
+        <w:spacing w:after="80"/>
+      </w:pPr>
+      <w:r>
+        <w:rPr>
+          <w:rFonts w:ascii="Microsoft YaHei" w:hAnsi="Microsoft YaHei" w:eastAsia="Microsoft YaHei"/>
+          <w:b/>
+          <w:sz w:val="21"/>
+        </w:rPr>
+        <w:t>这些λ不是固定答案，需要通过消融和验证集选择。通常先保证RGB/感知和几何损失稳定，再逐步增大稀疏与预算权重；如果一开始把压缩权重设得太大，模型会优先删高斯而不是学习正确场景。</w:t>
+      </w:r>
+    </w:p>
+    <w:p>
+      <w:pPr>
+        <w:spacing w:before="140" w:after="100"/>
+      </w:pPr>
+      <w:r>
+        <w:rPr>
+          <w:rFonts w:ascii="Microsoft YaHei" w:hAnsi="Microsoft YaHei" w:eastAsia="Microsoft YaHei"/>
+          <w:b/>
+          <w:sz w:val="26"/>
+        </w:rPr>
+        <w:t>21.9 各训练阶段实际打开哪些损失</w:t>
+      </w:r>
+    </w:p>
+    <w:tbl>
+      <w:tblPr>
+        <w:tblStyle w:val="TableGrid"/>
+        <w:tblW w:type="auto" w:w="0"/>
+        <w:tblLook w:firstColumn="1" w:firstRow="1" w:lastColumn="0" w:lastRow="0" w:noHBand="0" w:noVBand="1" w:val="04A0"/>
+      </w:tblPr>
+      <w:tblGrid>
+        <w:gridCol w:w="3324"/>
+        <w:gridCol w:w="3324"/>
+        <w:gridCol w:w="3324"/>
+      </w:tblGrid>
+      <w:tr>
+        <w:tc>
+          <w:tcPr>
+            <w:tcW w:type="dxa" w:w="3324"/>
+            <w:vAlign w:val="center"/>
+            <w:shd w:fill="D9EAF7"/>
+          </w:tcPr>
+          <w:p>
+            <w:pPr>
+              <w:jc w:val="left"/>
+            </w:pPr>
+            <w:r/>
+            <w:r>
+              <w:rPr>
+                <w:rFonts w:ascii="Microsoft YaHei" w:hAnsi="Microsoft YaHei" w:eastAsia="Microsoft YaHei"/>
+                <w:b/>
+                <w:sz w:val="19"/>
+              </w:rPr>
+              <w:t>阶段</w:t>
+            </w:r>
+          </w:p>
+        </w:tc>
+        <w:tc>
+          <w:tcPr>
+            <w:tcW w:type="dxa" w:w="3324"/>
+            <w:vAlign w:val="center"/>
+            <w:shd w:fill="D9EAF7"/>
+          </w:tcPr>
+          <w:p>
+            <w:pPr>
+              <w:jc w:val="left"/>
+            </w:pPr>
+            <w:r/>
+            <w:r>
+              <w:rPr>
+                <w:rFonts w:ascii="Microsoft YaHei" w:hAnsi="Microsoft YaHei" w:eastAsia="Microsoft YaHei"/>
+                <w:b/>
+                <w:sz w:val="19"/>
+              </w:rPr>
+              <w:t>主要打开的损失</w:t>
+            </w:r>
+          </w:p>
+        </w:tc>
+        <w:tc>
+          <w:tcPr>
+            <w:tcW w:type="dxa" w:w="3324"/>
+            <w:vAlign w:val="center"/>
+            <w:shd w:fill="D9EAF7"/>
+          </w:tcPr>
+          <w:p>
+            <w:pPr>
+              <w:jc w:val="left"/>
+            </w:pPr>
+            <w:r/>
+            <w:r>
+              <w:rPr>
+                <w:rFonts w:ascii="Microsoft YaHei" w:hAnsi="Microsoft YaHei" w:eastAsia="Microsoft YaHei"/>
+                <w:b/>
+                <w:sz w:val="19"/>
+              </w:rPr>
+              <w:t>暂时关闭或弱化</w:t>
+            </w:r>
+          </w:p>
+        </w:tc>
+      </w:tr>
+      <w:tr>
+        <w:tc>
+          <w:tcPr>
+            <w:tcW w:type="dxa" w:w="3324"/>
+            <w:vAlign w:val="center"/>
+          </w:tcPr>
+          <w:p>
+            <w:pPr>
+              <w:jc w:val="left"/>
+            </w:pPr>
+            <w:r/>
+            <w:r>
+              <w:rPr>
+                <w:rFonts w:ascii="Microsoft YaHei" w:hAnsi="Microsoft YaHei" w:eastAsia="Microsoft YaHei"/>
+                <w:b w:val="0"/>
+                <w:sz w:val="18"/>
+              </w:rPr>
+              <w:t>Stage 1：Keep/Gate</w:t>
+            </w:r>
+          </w:p>
+        </w:tc>
+        <w:tc>
+          <w:tcPr>
+            <w:tcW w:type="dxa" w:w="3324"/>
+            <w:vAlign w:val="center"/>
+          </w:tcPr>
+          <w:p>
+            <w:pPr>
+              <w:jc w:val="left"/>
+            </w:pPr>
+            <w:r/>
+            <w:r>
+              <w:rPr>
+                <w:rFonts w:ascii="Microsoft YaHei" w:hAnsi="Microsoft YaHei" w:eastAsia="Microsoft YaHei"/>
+                <w:b w:val="0"/>
+                <w:sz w:val="18"/>
+              </w:rPr>
+              <w:t>原SHARP渲染损失 + L_gate-sparse + L_budget + L_contrib</w:t>
+            </w:r>
+          </w:p>
+        </w:tc>
+        <w:tc>
+          <w:tcPr>
+            <w:tcW w:type="dxa" w:w="3324"/>
+            <w:vAlign w:val="center"/>
+          </w:tcPr>
+          <w:p>
+            <w:pPr>
+              <w:jc w:val="left"/>
+            </w:pPr>
+            <w:r/>
+            <w:r>
+              <w:rPr>
+                <w:rFonts w:ascii="Microsoft YaHei" w:hAnsi="Microsoft YaHei" w:eastAsia="Microsoft YaHei"/>
+                <w:b w:val="0"/>
+                <w:sz w:val="18"/>
+              </w:rPr>
+              <w:t>Split、Spawn和量化损失关闭</w:t>
+            </w:r>
+          </w:p>
+        </w:tc>
+      </w:tr>
+      <w:tr>
+        <w:tc>
+          <w:tcPr>
+            <w:tcW w:type="dxa" w:w="3324"/>
+            <w:vAlign w:val="center"/>
+          </w:tcPr>
+          <w:p>
+            <w:pPr>
+              <w:jc w:val="left"/>
+            </w:pPr>
+            <w:r/>
+            <w:r>
+              <w:rPr>
+                <w:rFonts w:ascii="Microsoft YaHei" w:hAnsi="Microsoft YaHei" w:eastAsia="Microsoft YaHei"/>
+                <w:b w:val="0"/>
+                <w:sz w:val="18"/>
+              </w:rPr>
+              <w:t>Stage 2：显露补全</w:t>
+            </w:r>
+          </w:p>
+        </w:tc>
+        <w:tc>
+          <w:tcPr>
+            <w:tcW w:type="dxa" w:w="3324"/>
+            <w:vAlign w:val="center"/>
+          </w:tcPr>
+          <w:p>
+            <w:pPr>
+              <w:jc w:val="left"/>
+            </w:pPr>
+            <w:r/>
+            <w:r>
+              <w:rPr>
+                <w:rFonts w:ascii="Microsoft YaHei" w:hAnsi="Microsoft YaHei" w:eastAsia="Microsoft YaHei"/>
+                <w:b w:val="0"/>
+                <w:sz w:val="18"/>
+              </w:rPr>
+              <w:t>L_comp-edge/depth/rgb/alpha + L_reproj + L_anchor + L_mid</w:t>
+            </w:r>
+          </w:p>
+        </w:tc>
+        <w:tc>
+          <w:tcPr>
+            <w:tcW w:type="dxa" w:w="3324"/>
+            <w:vAlign w:val="center"/>
+          </w:tcPr>
+          <w:p>
+            <w:pPr>
+              <w:jc w:val="left"/>
+            </w:pPr>
+            <w:r/>
+            <w:r>
+              <w:rPr>
+                <w:rFonts w:ascii="Microsoft YaHei" w:hAnsi="Microsoft YaHei" w:eastAsia="Microsoft YaHei"/>
+                <w:b w:val="0"/>
+                <w:sz w:val="18"/>
+              </w:rPr>
+              <w:t>Gate先冻结或小学习率，Split关闭</w:t>
+            </w:r>
+          </w:p>
+        </w:tc>
+      </w:tr>
+      <w:tr>
+        <w:tc>
+          <w:tcPr>
+            <w:tcW w:type="dxa" w:w="3324"/>
+            <w:vAlign w:val="center"/>
+          </w:tcPr>
+          <w:p>
+            <w:pPr>
+              <w:jc w:val="left"/>
+            </w:pPr>
+            <w:r/>
+            <w:r>
+              <w:rPr>
+                <w:rFonts w:ascii="Microsoft YaHei" w:hAnsi="Microsoft YaHei" w:eastAsia="Microsoft YaHei"/>
+                <w:b w:val="0"/>
+                <w:sz w:val="18"/>
+              </w:rPr>
+              <w:t>Stage 3：Split/Spawn</w:t>
+            </w:r>
+          </w:p>
+        </w:tc>
+        <w:tc>
+          <w:tcPr>
+            <w:tcW w:type="dxa" w:w="3324"/>
+            <w:vAlign w:val="center"/>
+          </w:tcPr>
+          <w:p>
+            <w:pPr>
+              <w:jc w:val="left"/>
+            </w:pPr>
+            <w:r/>
+            <w:r>
+              <w:rPr>
+                <w:rFonts w:ascii="Microsoft YaHei" w:hAnsi="Microsoft YaHei" w:eastAsia="Microsoft YaHei"/>
+                <w:b w:val="0"/>
+                <w:sz w:val="18"/>
+              </w:rPr>
+              <w:t>L_thin-render + L_split-budget + L_parent-child + L_split-geom + L_spawn</w:t>
+            </w:r>
+          </w:p>
+        </w:tc>
+        <w:tc>
+          <w:tcPr>
+            <w:tcW w:type="dxa" w:w="3324"/>
+            <w:vAlign w:val="center"/>
+          </w:tcPr>
+          <w:p>
+            <w:pPr>
+              <w:jc w:val="left"/>
+            </w:pPr>
+            <w:r/>
+            <w:r>
+              <w:rPr>
+                <w:rFonts w:ascii="Microsoft YaHei" w:hAnsi="Microsoft YaHei" w:eastAsia="Microsoft YaHei"/>
+                <w:b w:val="0"/>
+                <w:sz w:val="18"/>
+              </w:rPr>
+              <w:t>材质和量化先弱化</w:t>
+            </w:r>
+          </w:p>
+        </w:tc>
+      </w:tr>
+      <w:tr>
+        <w:tc>
+          <w:tcPr>
+            <w:tcW w:type="dxa" w:w="3324"/>
+            <w:vAlign w:val="center"/>
+          </w:tcPr>
+          <w:p>
+            <w:pPr>
+              <w:jc w:val="left"/>
+            </w:pPr>
+            <w:r/>
+            <w:r>
+              <w:rPr>
+                <w:rFonts w:ascii="Microsoft YaHei" w:hAnsi="Microsoft YaHei" w:eastAsia="Microsoft YaHei"/>
+                <w:b w:val="0"/>
+                <w:sz w:val="18"/>
+              </w:rPr>
+              <w:t>Stage 4：联合与压缩</w:t>
+            </w:r>
+          </w:p>
+        </w:tc>
+        <w:tc>
+          <w:tcPr>
+            <w:tcW w:type="dxa" w:w="3324"/>
+            <w:vAlign w:val="center"/>
+          </w:tcPr>
+          <w:p>
+            <w:pPr>
+              <w:jc w:val="left"/>
+            </w:pPr>
+            <w:r/>
+            <w:r>
+              <w:rPr>
+                <w:rFonts w:ascii="Microsoft YaHei" w:hAnsi="Microsoft YaHei" w:eastAsia="Microsoft YaHei"/>
+                <w:b w:val="0"/>
+                <w:sz w:val="18"/>
+              </w:rPr>
+              <w:t>完整渲染损失 + Gate/预算 + 量化/蒸馏</w:t>
+            </w:r>
+          </w:p>
+        </w:tc>
+        <w:tc>
+          <w:tcPr>
+            <w:tcW w:type="dxa" w:w="3324"/>
+            <w:vAlign w:val="center"/>
+          </w:tcPr>
+          <w:p>
+            <w:pPr>
+              <w:jc w:val="left"/>
+            </w:pPr>
+            <w:r/>
+            <w:r>
+              <w:rPr>
+                <w:rFonts w:ascii="Microsoft YaHei" w:hAnsi="Microsoft YaHei" w:eastAsia="Microsoft YaHei"/>
+                <w:b w:val="0"/>
+                <w:sz w:val="18"/>
+              </w:rPr>
+              <w:t>所有模块小学习率，避免互相抵消</w:t>
+            </w:r>
+          </w:p>
+        </w:tc>
+      </w:tr>
+    </w:tbl>
+    <w:p>
+      <w:pPr>
+        <w:spacing w:before="140" w:after="100"/>
+      </w:pPr>
+      <w:r>
+        <w:rPr>
+          <w:rFonts w:ascii="Microsoft YaHei" w:hAnsi="Microsoft YaHei" w:eastAsia="Microsoft YaHei"/>
+          <w:b/>
+          <w:sz w:val="26"/>
+        </w:rPr>
+        <w:t>21.10 最后用一句话理解</w:t>
+      </w:r>
+    </w:p>
+    <w:p>
+      <w:pPr>
+        <w:spacing w:after="80"/>
+      </w:pPr>
+      <w:r>
+        <w:rPr>
+          <w:rFonts w:ascii="Microsoft YaHei" w:hAnsi="Microsoft YaHei" w:eastAsia="Microsoft YaHei"/>
+          <w:b/>
+          <w:sz w:val="22"/>
+        </w:rPr>
+        <w:t>重建和感知损失负责“画得像”；Depth、Edge和Alpha负责“放得对”；端点与重投影损失负责“换视角仍然对”；Gate、Split和Spawn正则负责“该删的删、该加的加”；量化与蒸馏损失负责“压缩以后仍然像”。</w:t>
       </w:r>
     </w:p>
     <w:sectPr>

</xml_diff>